<commit_message>
Fix: real certs only, network-focused skills, no fake training items
</commit_message>
<xml_diff>
--- a/Yan_Naing_Kyaw_Senior_Network_Engineer.docx
+++ b/Yan_Naing_Kyaw_Senior_Network_Engineer.docx
@@ -15,7 +15,7 @@
       </w:tblGrid>
       <w:tr>
         <w:trPr>
-          <w:trHeight w:val="1814"/>
+          <w:trHeight w:val="1701"/>
         </w:trPr>
         <w:tc>
           <w:tcPr>
@@ -202,7 +202,7 @@
                 <w:color w:val="1A2A4A"/>
                 <w:sz w:val="14"/>
               </w:rPr>
-              <w:t xml:space="preserve">Networking: </w:t>
+              <w:t xml:space="preserve">Routing &amp; Switching: </w:t>
             </w:r>
             <w:r>
               <w:rPr>
@@ -210,7 +210,7 @@
                 <w:color w:val="555555"/>
                 <w:sz w:val="14"/>
               </w:rPr>
-              <w:t>BGP, OSPF, IS-IS, MPLS, MP-BGP, SD-WAN, VPN, VLAN, L2/L3 Design</w:t>
+              <w:t>BGP, OSPF, IS-IS, MP-BGP, L2/L3 Design, VLAN, STP</w:t>
             </w:r>
           </w:p>
           <w:p>
@@ -223,7 +223,7 @@
                 <w:color w:val="1A2A4A"/>
                 <w:sz w:val="14"/>
               </w:rPr>
-              <w:t xml:space="preserve">Cloud &amp; Virtualization: </w:t>
+              <w:t xml:space="preserve">MPLS &amp; WAN: </w:t>
             </w:r>
             <w:r>
               <w:rPr>
@@ -231,7 +231,7 @@
                 <w:color w:val="555555"/>
                 <w:sz w:val="14"/>
               </w:rPr>
-              <w:t>Cisco HyperFlex, Cisco UCS, VMware vCenter/ESXi, Private Cloud, MicroCloud</w:t>
+              <w:t>MPLS, MPLS VPN, TE, QoS, SD-WAN, VPN, IP Transit</w:t>
             </w:r>
           </w:p>
           <w:p>
@@ -244,7 +244,7 @@
                 <w:color w:val="1A2A4A"/>
                 <w:sz w:val="14"/>
               </w:rPr>
-              <w:t xml:space="preserve">Data Center: </w:t>
+              <w:t xml:space="preserve">Service Provider: </w:t>
             </w:r>
             <w:r>
               <w:rPr>
@@ -252,7 +252,7 @@
                 <w:color w:val="555555"/>
                 <w:sz w:val="14"/>
               </w:rPr>
-              <w:t>Cisco ACI, UCS Manager, FWaaS</w:t>
+              <w:t>FTTH, DIA, IGW, eBGP/iBGP, CDN Peering, Capacity Planning</w:t>
             </w:r>
           </w:p>
           <w:p>
@@ -286,7 +286,7 @@
                 <w:color w:val="1A2A4A"/>
                 <w:sz w:val="14"/>
               </w:rPr>
-              <w:t xml:space="preserve">Smart City &amp; IoT: </w:t>
+              <w:t xml:space="preserve">Data Center: </w:t>
             </w:r>
             <w:r>
               <w:rPr>
@@ -294,7 +294,7 @@
                 <w:color w:val="555555"/>
                 <w:sz w:val="14"/>
               </w:rPr>
-              <w:t>AI VMS, Eocortex, Scylla AI, IoT, GPU Infrastructure</w:t>
+              <w:t>Cisco ACI, Nexus, UCS, FWaaS</w:t>
             </w:r>
           </w:p>
           <w:p>
@@ -315,7 +315,7 @@
                 <w:color w:val="555555"/>
                 <w:sz w:val="14"/>
               </w:rPr>
-              <w:t>Zabbix, SNMP, Cacti, Cloud PBX, VoIP, SIP Trunking</w:t>
+              <w:t>Zabbix, SNMP, Cacti, VoIP/SIP</w:t>
             </w:r>
           </w:p>
           <w:p>
@@ -490,7 +490,7 @@
           </w:p>
           <w:p>
             <w:pPr>
-              <w:spacing w:before="0" w:after="40" w:line="276" w:lineRule="auto"/>
+              <w:spacing w:before="0" w:after="40" w:line="269" w:lineRule="auto"/>
             </w:pPr>
             <w:r>
               <w:rPr>
@@ -498,7 +498,7 @@
                 <w:color w:val="555555"/>
                 <w:sz w:val="16"/>
               </w:rPr>
-              <w:t>Senior Network, Cloud &amp; Infrastructure Engineer with 13+ years of experience across ISP, system integrator, private cloud, and Smart City environments. Expert in Cisco HyperFlex (HCI), VMware vCenter, Cisco UCS, Cisco ACI, and MicroCloud. Proven success designing, deploying, and operating large-scale, high-availability networks and Smart City platforms integrating video surveillance, IoT, and AI analytics.</w:t>
+              <w:t>Senior Network Engineer with 13+ years of experience in ISP core networks, routing protocols, MPLS, and service provider infrastructure. Specialized in BGP/OSPF/IS-IS, MPLS VPN, data center networking, and large-scale network design. Proven track record operating nationwide backbone networks and leading critical escalation response.</w:t>
             </w:r>
           </w:p>
           <w:p>
@@ -519,7 +519,7 @@
           </w:p>
           <w:p>
             <w:pPr>
-              <w:spacing w:before="80" w:after="0"/>
+              <w:spacing w:before="60" w:after="0"/>
             </w:pPr>
             <w:r>
               <w:rPr>
@@ -566,49 +566,7 @@
               <w:rPr>
                 <w:b w:val="0"/>
                 <w:color w:val="555555"/>
-                <w:sz w:val="15"/>
-              </w:rPr>
-              <w:t>▸ Designed and operated Cisco HyperFlex HCI and UCS-based private cloud environments</w:t>
-            </w:r>
-          </w:p>
-          <w:p>
-            <w:pPr>
-              <w:spacing w:before="0" w:after="0"/>
-              <w:ind w:left="227" w:hanging="170"/>
-            </w:pPr>
-            <w:r>
-              <w:rPr>
-                <w:b w:val="0"/>
-                <w:color w:val="555555"/>
-                <w:sz w:val="15"/>
-              </w:rPr>
-              <w:t>▸ Managed virtualization infrastructure using VMware vCenter and automated provisioning workflows</w:t>
-            </w:r>
-          </w:p>
-          <w:p>
-            <w:pPr>
-              <w:spacing w:before="0" w:after="0"/>
-              <w:ind w:left="227" w:hanging="170"/>
-            </w:pPr>
-            <w:r>
-              <w:rPr>
-                <w:b w:val="0"/>
-                <w:color w:val="555555"/>
-                <w:sz w:val="15"/>
-              </w:rPr>
-              <w:t>▸ Implemented MicroCloud environments for rapid POC and edge deployments</w:t>
-            </w:r>
-          </w:p>
-          <w:p>
-            <w:pPr>
-              <w:spacing w:before="0" w:after="0"/>
-              <w:ind w:left="227" w:hanging="170"/>
-            </w:pPr>
-            <w:r>
-              <w:rPr>
-                <w:b w:val="0"/>
-                <w:color w:val="555555"/>
-                <w:sz w:val="15"/>
+                <w:sz w:val="14"/>
               </w:rPr>
               <w:t>▸ Engineered multi-tenant network architecture (VLANs, VPNs, firewalls, routing) ensuring isolation and scalability</w:t>
             </w:r>
@@ -622,7 +580,7 @@
               <w:rPr>
                 <w:b w:val="0"/>
                 <w:color w:val="555555"/>
-                <w:sz w:val="15"/>
+                <w:sz w:val="14"/>
               </w:rPr>
               <w:t>▸ Applied Cisco ACI for policy-driven data center networking</w:t>
             </w:r>
@@ -636,7 +594,7 @@
               <w:rPr>
                 <w:b w:val="0"/>
                 <w:color w:val="555555"/>
-                <w:sz w:val="15"/>
+                <w:sz w:val="14"/>
               </w:rPr>
               <w:t>▸ Delivered Smart City network solutions integrating video surveillance, IoT, and central management</w:t>
             </w:r>
@@ -650,14 +608,28 @@
               <w:rPr>
                 <w:b w:val="0"/>
                 <w:color w:val="555555"/>
-                <w:sz w:val="15"/>
+                <w:sz w:val="14"/>
               </w:rPr>
-              <w:t>▸ Designed and implemented SPDC Data Center and FWaaS solutions</w:t>
+              <w:t>▸ Designed and implemented SPDC Data Center and FWaaS firewall solutions</w:t>
             </w:r>
           </w:p>
           <w:p>
             <w:pPr>
-              <w:spacing w:before="80" w:after="0"/>
+              <w:spacing w:before="0" w:after="0"/>
+              <w:ind w:left="227" w:hanging="170"/>
+            </w:pPr>
+            <w:r>
+              <w:rPr>
+                <w:b w:val="0"/>
+                <w:color w:val="555555"/>
+                <w:sz w:val="14"/>
+              </w:rPr>
+              <w:t>▸ Collaborated with cross-vendor teams for integrated network and infrastructure deployments</w:t>
+            </w:r>
+          </w:p>
+          <w:p>
+            <w:pPr>
+              <w:spacing w:before="60" w:after="0"/>
             </w:pPr>
             <w:r>
               <w:rPr>
@@ -704,7 +676,7 @@
               <w:rPr>
                 <w:b w:val="0"/>
                 <w:color w:val="555555"/>
-                <w:sz w:val="15"/>
+                <w:sz w:val="14"/>
               </w:rPr>
               <w:t>▸ Operated nationwide ISP core network infrastructure supporting millions of users</w:t>
             </w:r>
@@ -718,7 +690,7 @@
               <w:rPr>
                 <w:b w:val="0"/>
                 <w:color w:val="555555"/>
-                <w:sz w:val="15"/>
+                <w:sz w:val="14"/>
               </w:rPr>
               <w:t>▸ Designed and implemented IP Transit, MPLS VPN, FTTH, DIA, and WAN services</w:t>
             </w:r>
@@ -732,7 +704,7 @@
               <w:rPr>
                 <w:b w:val="0"/>
                 <w:color w:val="555555"/>
-                <w:sz w:val="15"/>
+                <w:sz w:val="14"/>
               </w:rPr>
               <w:t>▸ Led L2/L3 escalation response for critical nationwide network outages</w:t>
             </w:r>
@@ -746,7 +718,7 @@
               <w:rPr>
                 <w:b w:val="0"/>
                 <w:color w:val="555555"/>
-                <w:sz w:val="15"/>
+                <w:sz w:val="14"/>
               </w:rPr>
               <w:t>▸ Built International Gateway networks with eBGP/iBGP peering and global CDNs (Google, Facebook, Netflix)</w:t>
             </w:r>
@@ -760,9 +732,9 @@
               <w:rPr>
                 <w:b w:val="0"/>
                 <w:color w:val="555555"/>
-                <w:sz w:val="15"/>
+                <w:sz w:val="14"/>
               </w:rPr>
-              <w:t>▸ Deployed MPLS core network using IS-IS, MP-BGP, TE, and QoS</w:t>
+              <w:t>▸ Deployed MPLS core network using IS-IS, MP-BGP, Traffic Engineering, and QoS</w:t>
             </w:r>
           </w:p>
           <w:p>
@@ -774,7 +746,7 @@
               <w:rPr>
                 <w:b w:val="0"/>
                 <w:color w:val="555555"/>
-                <w:sz w:val="15"/>
+                <w:sz w:val="14"/>
               </w:rPr>
               <w:t>▸ Conducted capacity planning and 160G–400G backbone upgrades</w:t>
             </w:r>
@@ -788,14 +760,14 @@
               <w:rPr>
                 <w:b w:val="0"/>
                 <w:color w:val="555555"/>
-                <w:sz w:val="15"/>
+                <w:sz w:val="14"/>
               </w:rPr>
               <w:t>▸ Expanded POP sites and multi-service platforms for high availability and redundancy</w:t>
             </w:r>
           </w:p>
           <w:p>
             <w:pPr>
-              <w:spacing w:before="80" w:after="0"/>
+              <w:spacing w:before="60" w:after="0"/>
             </w:pPr>
             <w:r>
               <w:rPr>
@@ -803,7 +775,7 @@
                 <w:color w:val="1A2A4A"/>
                 <w:sz w:val="18"/>
               </w:rPr>
-              <w:t>Smart City &amp; AI Platform Projects</w:t>
+              <w:t>Smart City &amp; Network Projects</w:t>
             </w:r>
             <w:r>
               <w:rPr>
@@ -842,7 +814,7 @@
               <w:rPr>
                 <w:b w:val="0"/>
                 <w:color w:val="555555"/>
-                <w:sz w:val="15"/>
+                <w:sz w:val="14"/>
               </w:rPr>
               <w:t>▸ Designed Smart City network infrastructure for urban surveillance and IoT integration</w:t>
             </w:r>
@@ -856,35 +828,7 @@
               <w:rPr>
                 <w:b w:val="0"/>
                 <w:color w:val="555555"/>
-                <w:sz w:val="15"/>
-              </w:rPr>
-              <w:t>▸ Deployed AI VMS (Eocortex, Scylla AI) with facial recognition, object detection, and analytics</w:t>
-            </w:r>
-          </w:p>
-          <w:p>
-            <w:pPr>
-              <w:spacing w:before="0" w:after="0"/>
-              <w:ind w:left="227" w:hanging="170"/>
-            </w:pPr>
-            <w:r>
-              <w:rPr>
-                <w:b w:val="0"/>
-                <w:color w:val="555555"/>
-                <w:sz w:val="15"/>
-              </w:rPr>
-              <w:t>▸ Architected GPU-enabled edge and data center environments for real-time AI inference</w:t>
-            </w:r>
-          </w:p>
-          <w:p>
-            <w:pPr>
-              <w:spacing w:before="0" w:after="0"/>
-              <w:ind w:left="227" w:hanging="170"/>
-            </w:pPr>
-            <w:r>
-              <w:rPr>
-                <w:b w:val="0"/>
-                <w:color w:val="555555"/>
-                <w:sz w:val="15"/>
+                <w:sz w:val="14"/>
               </w:rPr>
               <w:t>▸ Built secure, high-availability connectivity between edge devices, data centers, and private clouds</w:t>
             </w:r>
@@ -914,7 +858,7 @@
               <w:rPr>
                 <w:b w:val="0"/>
                 <w:color w:val="4A6A8A"/>
-                <w:sz w:val="15"/>
+                <w:sz w:val="14"/>
               </w:rPr>
               <w:t xml:space="preserve">▸ </w:t>
             </w:r>
@@ -922,7 +866,7 @@
               <w:rPr>
                 <w:b/>
                 <w:color w:val="1A2A4A"/>
-                <w:sz w:val="15"/>
+                <w:sz w:val="14"/>
               </w:rPr>
               <w:t>Cisco Certified Specialist – ENARSI</w:t>
             </w:r>
@@ -930,9 +874,9 @@
               <w:rPr>
                 <w:b w:val="0"/>
                 <w:color w:val="555555"/>
-                <w:sz w:val="15"/>
+                <w:sz w:val="14"/>
               </w:rPr>
-              <w:t xml:space="preserve"> — Cisco Certified</w:t>
+              <w:t xml:space="preserve">  —  Cisco Certified</w:t>
             </w:r>
           </w:p>
           <w:p>
@@ -944,7 +888,7 @@
               <w:rPr>
                 <w:b w:val="0"/>
                 <w:color w:val="4A6A8A"/>
-                <w:sz w:val="15"/>
+                <w:sz w:val="14"/>
               </w:rPr>
               <w:t xml:space="preserve">▸ </w:t>
             </w:r>
@@ -952,7 +896,7 @@
               <w:rPr>
                 <w:b/>
                 <w:color w:val="1A2A4A"/>
-                <w:sz w:val="15"/>
+                <w:sz w:val="14"/>
               </w:rPr>
               <w:t>CCIE Service Provider</w:t>
             </w:r>
@@ -960,9 +904,9 @@
               <w:rPr>
                 <w:b w:val="0"/>
                 <w:color w:val="555555"/>
-                <w:sz w:val="15"/>
+                <w:sz w:val="14"/>
               </w:rPr>
-              <w:t xml:space="preserve"> — Training</w:t>
+              <w:t xml:space="preserve">  —  Training</w:t>
             </w:r>
           </w:p>
           <w:p>
@@ -974,7 +918,7 @@
               <w:rPr>
                 <w:b w:val="0"/>
                 <w:color w:val="4A6A8A"/>
-                <w:sz w:val="15"/>
+                <w:sz w:val="14"/>
               </w:rPr>
               <w:t xml:space="preserve">▸ </w:t>
             </w:r>
@@ -982,17 +926,17 @@
               <w:rPr>
                 <w:b/>
                 <w:color w:val="1A2A4A"/>
-                <w:sz w:val="15"/>
+                <w:sz w:val="14"/>
               </w:rPr>
-              <w:t>Cisco HyperFlex (HCI)</w:t>
+              <w:t>CCIE Enterprise Infrastructure</w:t>
             </w:r>
             <w:r>
               <w:rPr>
                 <w:b w:val="0"/>
                 <w:color w:val="555555"/>
-                <w:sz w:val="15"/>
+                <w:sz w:val="14"/>
               </w:rPr>
-              <w:t xml:space="preserve"> — Training</w:t>
+              <w:t xml:space="preserve">  —  Training</w:t>
             </w:r>
           </w:p>
           <w:p>
@@ -1004,7 +948,7 @@
               <w:rPr>
                 <w:b w:val="0"/>
                 <w:color w:val="4A6A8A"/>
-                <w:sz w:val="15"/>
+                <w:sz w:val="14"/>
               </w:rPr>
               <w:t xml:space="preserve">▸ </w:t>
             </w:r>
@@ -1012,137 +956,17 @@
               <w:rPr>
                 <w:b/>
                 <w:color w:val="1A2A4A"/>
-                <w:sz w:val="15"/>
+                <w:sz w:val="14"/>
               </w:rPr>
-              <w:t>Cisco ACI</w:t>
+              <w:t>CCNP Routing &amp; Switching</w:t>
             </w:r>
             <w:r>
               <w:rPr>
                 <w:b w:val="0"/>
                 <w:color w:val="555555"/>
-                <w:sz w:val="15"/>
+                <w:sz w:val="14"/>
               </w:rPr>
-              <w:t xml:space="preserve"> — Training</w:t>
-            </w:r>
-          </w:p>
-          <w:p>
-            <w:pPr>
-              <w:spacing w:before="0" w:after="20"/>
-              <w:ind w:left="170" w:hanging="113"/>
-            </w:pPr>
-            <w:r>
-              <w:rPr>
-                <w:b w:val="0"/>
-                <w:color w:val="4A6A8A"/>
-                <w:sz w:val="15"/>
-              </w:rPr>
-              <w:t xml:space="preserve">▸ </w:t>
-            </w:r>
-            <w:r>
-              <w:rPr>
-                <w:b/>
-                <w:color w:val="1A2A4A"/>
-                <w:sz w:val="15"/>
-              </w:rPr>
-              <w:t>VMware vCenter / ESXi</w:t>
-            </w:r>
-            <w:r>
-              <w:rPr>
-                <w:b w:val="0"/>
-                <w:color w:val="555555"/>
-                <w:sz w:val="15"/>
-              </w:rPr>
-              <w:t xml:space="preserve"> — Training</w:t>
-            </w:r>
-          </w:p>
-          <w:p>
-            <w:pPr>
-              <w:spacing w:before="0" w:after="20"/>
-              <w:ind w:left="170" w:hanging="113"/>
-            </w:pPr>
-            <w:r>
-              <w:rPr>
-                <w:b w:val="0"/>
-                <w:color w:val="4A6A8A"/>
-                <w:sz w:val="15"/>
-              </w:rPr>
-              <w:t xml:space="preserve">▸ </w:t>
-            </w:r>
-            <w:r>
-              <w:rPr>
-                <w:b/>
-                <w:color w:val="1A2A4A"/>
-                <w:sz w:val="15"/>
-              </w:rPr>
-              <w:t>FortiGate Security</w:t>
-            </w:r>
-            <w:r>
-              <w:rPr>
-                <w:b w:val="0"/>
-                <w:color w:val="555555"/>
-                <w:sz w:val="15"/>
-              </w:rPr>
-              <w:t xml:space="preserve"> — Training</w:t>
-            </w:r>
-          </w:p>
-          <w:p>
-            <w:pPr>
-              <w:spacing w:before="0" w:after="20"/>
-              <w:ind w:left="170" w:hanging="113"/>
-            </w:pPr>
-            <w:r>
-              <w:rPr>
-                <w:b w:val="0"/>
-                <w:color w:val="4A6A8A"/>
-                <w:sz w:val="15"/>
-              </w:rPr>
-              <w:t xml:space="preserve">▸ </w:t>
-            </w:r>
-            <w:r>
-              <w:rPr>
-                <w:b/>
-                <w:color w:val="1A2A4A"/>
-                <w:sz w:val="15"/>
-              </w:rPr>
-              <w:t>Cisco FTD / ASA / FMC</w:t>
-            </w:r>
-            <w:r>
-              <w:rPr>
-                <w:b w:val="0"/>
-                <w:color w:val="555555"/>
-                <w:sz w:val="15"/>
-              </w:rPr>
-              <w:t xml:space="preserve"> — Training</w:t>
-            </w:r>
-          </w:p>
-          <w:p>
-            <w:pPr>
-              <w:spacing w:before="0" w:after="20"/>
-              <w:ind w:left="170" w:hanging="113"/>
-            </w:pPr>
-            <w:r>
-              <w:rPr>
-                <w:b w:val="0"/>
-                <w:color w:val="4A6A8A"/>
-                <w:sz w:val="15"/>
-              </w:rPr>
-              <w:t xml:space="preserve">▸ </w:t>
-            </w:r>
-            <w:r>
-              <w:rPr>
-                <w:b/>
-                <w:color w:val="1A2A4A"/>
-                <w:sz w:val="15"/>
-              </w:rPr>
-              <w:t>Eocortex AI VMS</w:t>
-            </w:r>
-            <w:r>
-              <w:rPr>
-                <w:b w:val="0"/>
-                <w:color w:val="555555"/>
-                <w:sz w:val="15"/>
-              </w:rPr>
-              <w:t xml:space="preserve"> — Training</w:t>
+              <w:t xml:space="preserve">  —  Training</w:t>
             </w:r>
           </w:p>
           <w:p>
@@ -1163,7 +987,7 @@
           </w:p>
           <w:p>
             <w:pPr>
-              <w:spacing w:before="0" w:after="40" w:line="276" w:lineRule="auto"/>
+              <w:spacing w:before="0" w:after="40" w:line="269" w:lineRule="auto"/>
             </w:pPr>
             <w:r>
               <w:rPr>
@@ -1171,7 +995,7 @@
                 <w:color w:val="555555"/>
                 <w:sz w:val="16"/>
               </w:rPr>
-              <w:t>Cisco ASR9K, NCS 5500/6000, Juniper MX, Nexus 9K/7K/5K/2K, Catalyst 9K, UCS B/C-Series, HyperFlex HX-Series, VMware vCenter, Cisco FMC/FTD/ASA, FortiGate, MikroTik, Zabbix</w:t>
+              <w:t>Cisco ASR9K, NCS 5500/6000, Juniper MX, Nexus 9K/7K/5K/2K, Catalyst 9K, Cisco UCS, Cisco ACI, Cisco FMC/FTD/ASA, FortiGate, MikroTik, Zabbix</w:t>
             </w:r>
           </w:p>
         </w:tc>
@@ -1551,7 +1375,7 @@
     <w:qFormat/>
     <w:rsid w:val="00FC693F"/>
     <w:pPr>
-      <w:spacing w:before="0" w:after="40" w:line="259" w:lineRule="auto"/>
+      <w:spacing w:before="0" w:after="40" w:line="254" w:lineRule="auto"/>
     </w:pPr>
     <w:rPr>
       <w:rFonts w:ascii="Calibri" w:hAnsi="Calibri"/>

</xml_diff>

<commit_message>
Clean 2-page layout, more spacing, no sidebar/clutter, removed Thai lang
</commit_message>
<xml_diff>
--- a/Yan_Naing_Kyaw_Senior_Network_Engineer.docx
+++ b/Yan_Naing_Kyaw_Senior_Network_Engineer.docx
@@ -2,1008 +2,791 @@
 <file path=word/document.xml><?xml version="1.0" encoding="utf-8"?>
 <w:document xmlns:wpc="http://schemas.microsoft.com/office/word/2010/wordprocessingCanvas" xmlns:mo="http://schemas.microsoft.com/office/mac/office/2008/main" xmlns:mc="http://schemas.openxmlformats.org/markup-compatibility/2006" xmlns:mv="urn:schemas-microsoft-com:mac:vml" xmlns:o="urn:schemas-microsoft-com:office:office" xmlns:r="http://schemas.openxmlformats.org/officeDocument/2006/relationships" xmlns:m="http://schemas.openxmlformats.org/officeDocument/2006/math" xmlns:v="urn:schemas-microsoft-com:vml" xmlns:wp14="http://schemas.microsoft.com/office/word/2010/wordprocessingDrawing" xmlns:wp="http://schemas.openxmlformats.org/drawingml/2006/wordprocessingDrawing" xmlns:w10="urn:schemas-microsoft-com:office:word" xmlns:w="http://schemas.openxmlformats.org/wordprocessingml/2006/main" xmlns:w14="http://schemas.microsoft.com/office/word/2010/wordml" xmlns:wpg="http://schemas.microsoft.com/office/word/2010/wordprocessingGroup" xmlns:wpi="http://schemas.microsoft.com/office/word/2010/wordprocessingInk" xmlns:wne="http://schemas.microsoft.com/office/word/2006/wordml" xmlns:wps="http://schemas.microsoft.com/office/word/2010/wordprocessingShape" mc:Ignorable="w14 wp14">
   <w:body>
-    <w:tbl>
-      <w:tblPr>
-        <w:tblStyle w:val="TableGrid"/>
-        <w:tblW w:type="auto" w:w="0"/>
-        <w:jc w:val="center"/>
-        <w:tblLook w:firstColumn="1" w:firstRow="1" w:lastColumn="0" w:lastRow="0" w:noHBand="0" w:noVBand="1" w:val="04A0"/>
-      </w:tblPr>
-      <w:tblGrid>
-        <w:gridCol w:w="8504"/>
-        <w:gridCol w:w="1701"/>
-      </w:tblGrid>
-      <w:tr>
-        <w:trPr>
-          <w:trHeight w:val="1701"/>
-        </w:trPr>
-        <w:tc>
-          <w:tcPr>
-            <w:tcW w:type="dxa" w:w="5440"/>
-            <w:shd w:fill="1A2A4A"/>
-            <w:tcBorders>
-              <w:top w:val="nil"/>
-              <w:left w:val="nil"/>
-              <w:bottom w:val="nil"/>
-              <w:right w:val="nil"/>
-            </w:tcBorders>
-          </w:tcPr>
-          <w:p>
-            <w:pPr>
-              <w:spacing w:before="0" w:after="0"/>
-              <w:jc w:val="left"/>
-            </w:pPr>
-            <w:r>
-              <w:rPr>
-                <w:b/>
-                <w:color w:val="FFFFFF"/>
-                <w:sz w:val="40"/>
-              </w:rPr>
-              <w:t>YAN NAING KYAW</w:t>
-            </w:r>
-          </w:p>
-          <w:p>
-            <w:pPr>
-              <w:spacing w:before="0" w:after="0"/>
-            </w:pPr>
-            <w:r>
-              <w:rPr>
-                <w:b w:val="0"/>
-                <w:color w:val="7EB8E0"/>
-                <w:sz w:val="20"/>
-              </w:rPr>
-              <w:t>Senior Network &amp; Solution Engineer</w:t>
-            </w:r>
-          </w:p>
-          <w:p>
-            <w:pPr>
-              <w:spacing w:before="0" w:after="0" w:line="264" w:lineRule="auto"/>
-            </w:pPr>
-            <w:r>
-              <w:rPr>
-                <w:b w:val="0"/>
-                <w:color w:val="B0C4D8"/>
-                <w:sz w:val="14"/>
-              </w:rPr>
-              <w:t>✉ ynk.engineer@gmail.com | 📞 +66 06-3327-5176</w:t>
-            </w:r>
-          </w:p>
-          <w:p>
-            <w:pPr>
-              <w:spacing w:before="0" w:after="0" w:line="264" w:lineRule="auto"/>
-            </w:pPr>
-            <w:r>
-              <w:rPr>
-                <w:b w:val="0"/>
-                <w:color w:val="B0C4D8"/>
-                <w:sz w:val="14"/>
-              </w:rPr>
-              <w:t>🔗 linkedin.com/in/yann-naing-kyaw-3ba69a10a</w:t>
-            </w:r>
-          </w:p>
-          <w:p>
-            <w:pPr>
-              <w:spacing w:before="0" w:after="0" w:line="264" w:lineRule="auto"/>
-            </w:pPr>
-            <w:r>
-              <w:rPr>
-                <w:b w:val="0"/>
-                <w:color w:val="B0C4D8"/>
-                <w:sz w:val="14"/>
-              </w:rPr>
-              <w:t>🌐 yannaingkyaw.github.io/portfolio | 📍 Bangkok, Thailand</w:t>
-            </w:r>
-          </w:p>
-        </w:tc>
-        <w:tc>
-          <w:tcPr>
-            <w:tcW w:type="dxa" w:w="1701"/>
-            <w:shd w:fill="1A2A4A"/>
-            <w:tcBorders>
-              <w:top w:val="nil"/>
-              <w:left w:val="nil"/>
-              <w:bottom w:val="nil"/>
-              <w:right w:val="nil"/>
-            </w:tcBorders>
-          </w:tcPr>
-          <w:p>
-            <w:pPr>
-              <w:jc w:val="center"/>
-            </w:pPr>
-            <w:r>
-              <w:drawing>
-                <wp:inline xmlns:a="http://schemas.openxmlformats.org/drawingml/2006/main" xmlns:pic="http://schemas.openxmlformats.org/drawingml/2006/picture">
-                  <wp:extent cx="792000" cy="1026000"/>
-                  <wp:docPr id="1" name="Picture 1"/>
-                  <wp:cNvGraphicFramePr>
-                    <a:graphicFrameLocks noChangeAspect="1"/>
-                  </wp:cNvGraphicFramePr>
-                  <a:graphic>
-                    <a:graphicData uri="http://schemas.openxmlformats.org/drawingml/2006/picture">
-                      <pic:pic>
-                        <pic:nvPicPr>
-                          <pic:cNvPr id="0" name="ynk_photo.png"/>
-                          <pic:cNvPicPr/>
-                        </pic:nvPicPr>
-                        <pic:blipFill>
-                          <a:blip r:embed="rId9"/>
-                          <a:stretch>
-                            <a:fillRect/>
-                          </a:stretch>
-                        </pic:blipFill>
-                        <pic:spPr>
-                          <a:xfrm>
-                            <a:off x="0" y="0"/>
-                            <a:ext cx="792000" cy="1026000"/>
-                          </a:xfrm>
-                          <a:prstGeom prst="rect"/>
-                        </pic:spPr>
-                      </pic:pic>
-                    </a:graphicData>
-                  </a:graphic>
-                </wp:inline>
-              </w:drawing>
-            </w:r>
-          </w:p>
-        </w:tc>
-      </w:tr>
-    </w:tbl>
-    <w:p/>
-    <w:tbl>
-      <w:tblPr>
-        <w:tblW w:type="auto" w:w="0"/>
-        <w:jc w:val="center"/>
-        <w:tblLook w:firstColumn="1" w:firstRow="1" w:lastColumn="0" w:lastRow="0" w:noHBand="0" w:noVBand="1" w:val="04A0"/>
-      </w:tblPr>
-      <w:tblGrid>
-        <w:gridCol w:w="2551"/>
-        <w:gridCol w:w="7654"/>
-      </w:tblGrid>
-      <w:tr>
-        <w:tc>
-          <w:tcPr>
-            <w:tcW w:type="dxa" w:w="2551"/>
-            <w:shd w:fill="F4F6F9"/>
-            <w:tcBorders>
-              <w:top w:val="nil"/>
-              <w:left w:val="nil"/>
-              <w:bottom w:val="nil"/>
-              <w:right w:val="nil"/>
-            </w:tcBorders>
-          </w:tcPr>
-          <w:p>
-            <w:pPr>
-              <w:spacing w:after="0"/>
-            </w:pPr>
-          </w:p>
-          <w:p>
-            <w:pPr>
-              <w:spacing w:before="40" w:after="40"/>
-              <w:pBdr>
-                <w:bottom w:val="single" w:sz="6" w:space="1" w:color="1A2A4A"/>
-              </w:pBdr>
-            </w:pPr>
-            <w:r>
-              <w:rPr>
-                <w:b/>
-                <w:color w:val="1A2A4A"/>
-                <w:sz w:val="15"/>
-              </w:rPr>
-              <w:t>SKILLS</w:t>
-            </w:r>
-          </w:p>
-          <w:p>
-            <w:pPr>
-              <w:spacing w:before="0" w:after="20"/>
-            </w:pPr>
-            <w:r>
-              <w:rPr>
-                <w:b/>
-                <w:color w:val="1A2A4A"/>
-                <w:sz w:val="14"/>
-              </w:rPr>
-              <w:t xml:space="preserve">Routing &amp; Switching: </w:t>
-            </w:r>
-            <w:r>
-              <w:rPr>
-                <w:b w:val="0"/>
-                <w:color w:val="555555"/>
-                <w:sz w:val="14"/>
-              </w:rPr>
-              <w:t>BGP, OSPF, IS-IS, MP-BGP, L2/L3 Design, VLAN, STP</w:t>
-            </w:r>
-          </w:p>
-          <w:p>
-            <w:pPr>
-              <w:spacing w:before="0" w:after="20"/>
-            </w:pPr>
-            <w:r>
-              <w:rPr>
-                <w:b/>
-                <w:color w:val="1A2A4A"/>
-                <w:sz w:val="14"/>
-              </w:rPr>
-              <w:t xml:space="preserve">MPLS &amp; WAN: </w:t>
-            </w:r>
-            <w:r>
-              <w:rPr>
-                <w:b w:val="0"/>
-                <w:color w:val="555555"/>
-                <w:sz w:val="14"/>
-              </w:rPr>
-              <w:t>MPLS, MPLS VPN, TE, QoS, SD-WAN, VPN, IP Transit</w:t>
-            </w:r>
-          </w:p>
-          <w:p>
-            <w:pPr>
-              <w:spacing w:before="0" w:after="20"/>
-            </w:pPr>
-            <w:r>
-              <w:rPr>
-                <w:b/>
-                <w:color w:val="1A2A4A"/>
-                <w:sz w:val="14"/>
-              </w:rPr>
-              <w:t xml:space="preserve">Service Provider: </w:t>
-            </w:r>
-            <w:r>
-              <w:rPr>
-                <w:b w:val="0"/>
-                <w:color w:val="555555"/>
-                <w:sz w:val="14"/>
-              </w:rPr>
-              <w:t>FTTH, DIA, IGW, eBGP/iBGP, CDN Peering, Capacity Planning</w:t>
-            </w:r>
-          </w:p>
-          <w:p>
-            <w:pPr>
-              <w:spacing w:before="0" w:after="20"/>
-            </w:pPr>
-            <w:r>
-              <w:rPr>
-                <w:b/>
-                <w:color w:val="1A2A4A"/>
-                <w:sz w:val="14"/>
-              </w:rPr>
-              <w:t xml:space="preserve">Security: </w:t>
-            </w:r>
-            <w:r>
-              <w:rPr>
-                <w:b w:val="0"/>
-                <w:color w:val="555555"/>
-                <w:sz w:val="14"/>
-              </w:rPr>
-              <w:t>Cisco FTD/ASA/FMC, FortiGate</w:t>
-            </w:r>
-          </w:p>
-          <w:p>
-            <w:pPr>
-              <w:spacing w:before="0" w:after="20"/>
-            </w:pPr>
-            <w:r>
-              <w:rPr>
-                <w:b/>
-                <w:color w:val="1A2A4A"/>
-                <w:sz w:val="14"/>
-              </w:rPr>
-              <w:t xml:space="preserve">Data Center: </w:t>
-            </w:r>
-            <w:r>
-              <w:rPr>
-                <w:b w:val="0"/>
-                <w:color w:val="555555"/>
-                <w:sz w:val="14"/>
-              </w:rPr>
-              <w:t>Cisco ACI, Nexus, UCS, FWaaS</w:t>
-            </w:r>
-          </w:p>
-          <w:p>
-            <w:pPr>
-              <w:spacing w:before="0" w:after="20"/>
-            </w:pPr>
-            <w:r>
-              <w:rPr>
-                <w:b/>
-                <w:color w:val="1A2A4A"/>
-                <w:sz w:val="14"/>
-              </w:rPr>
-              <w:t xml:space="preserve">Monitoring &amp; Voice: </w:t>
-            </w:r>
-            <w:r>
-              <w:rPr>
-                <w:b w:val="0"/>
-                <w:color w:val="555555"/>
-                <w:sz w:val="14"/>
-              </w:rPr>
-              <w:t>Zabbix, SNMP, Cacti, VoIP/SIP</w:t>
-            </w:r>
-          </w:p>
-          <w:p>
-            <w:pPr>
-              <w:spacing w:before="80" w:after="80"/>
-              <w:pBdr>
-                <w:bottom w:val="single" w:sz="4" w:space="1" w:color="D5DDE8"/>
-              </w:pBdr>
-            </w:pPr>
-          </w:p>
-          <w:p>
-            <w:pPr>
-              <w:spacing w:before="40" w:after="40"/>
-              <w:pBdr>
-                <w:bottom w:val="single" w:sz="6" w:space="1" w:color="1A2A4A"/>
-              </w:pBdr>
-            </w:pPr>
-            <w:r>
-              <w:rPr>
-                <w:b/>
-                <w:color w:val="1A2A4A"/>
-                <w:sz w:val="15"/>
-              </w:rPr>
-              <w:t>LANGUAGES</w:t>
-            </w:r>
-          </w:p>
-          <w:p>
-            <w:pPr>
-              <w:spacing w:before="0" w:after="0"/>
-            </w:pPr>
-            <w:r>
-              <w:rPr>
-                <w:b/>
-                <w:color w:val="4A6A8A"/>
-                <w:sz w:val="14"/>
-              </w:rPr>
-              <w:t>English</w:t>
-              <w:br/>
-            </w:r>
-            <w:r>
-              <w:rPr>
-                <w:b w:val="0"/>
-                <w:color w:val="555555"/>
-                <w:sz w:val="14"/>
-              </w:rPr>
-              <w:t>Professional Working</w:t>
-            </w:r>
-          </w:p>
-          <w:p>
-            <w:pPr>
-              <w:spacing w:before="0" w:after="0"/>
-            </w:pPr>
-            <w:r>
-              <w:rPr>
-                <w:b/>
-                <w:color w:val="4A6A8A"/>
-                <w:sz w:val="14"/>
-              </w:rPr>
-              <w:t>Burmese</w:t>
-              <w:br/>
-            </w:r>
-            <w:r>
-              <w:rPr>
-                <w:b w:val="0"/>
-                <w:color w:val="555555"/>
-                <w:sz w:val="14"/>
-              </w:rPr>
-              <w:t>Native</w:t>
-            </w:r>
-          </w:p>
-          <w:p>
-            <w:pPr>
-              <w:spacing w:before="0" w:after="0"/>
-            </w:pPr>
-            <w:r>
-              <w:rPr>
-                <w:b/>
-                <w:color w:val="4A6A8A"/>
-                <w:sz w:val="14"/>
-              </w:rPr>
-              <w:t>Thai</w:t>
-              <w:br/>
-            </w:r>
-            <w:r>
-              <w:rPr>
-                <w:b w:val="0"/>
-                <w:color w:val="555555"/>
-                <w:sz w:val="14"/>
-              </w:rPr>
-              <w:t>Basic</w:t>
-            </w:r>
-          </w:p>
-          <w:p>
-            <w:pPr>
-              <w:spacing w:before="80" w:after="80"/>
-              <w:pBdr>
-                <w:bottom w:val="single" w:sz="4" w:space="1" w:color="D5DDE8"/>
-              </w:pBdr>
-            </w:pPr>
-          </w:p>
-          <w:p>
-            <w:pPr>
-              <w:spacing w:before="40" w:after="40"/>
-              <w:pBdr>
-                <w:bottom w:val="single" w:sz="6" w:space="1" w:color="1A2A4A"/>
-              </w:pBdr>
-            </w:pPr>
-            <w:r>
-              <w:rPr>
-                <w:b/>
-                <w:color w:val="1A2A4A"/>
-                <w:sz w:val="15"/>
-              </w:rPr>
-              <w:t>EDUCATION</w:t>
-            </w:r>
-          </w:p>
-          <w:p>
-            <w:pPr>
-              <w:spacing w:before="0" w:after="0"/>
-            </w:pPr>
-            <w:r>
-              <w:rPr>
-                <w:b/>
-                <w:color w:val="4A6A8A"/>
-                <w:sz w:val="14"/>
-              </w:rPr>
-              <w:t>B.A. English</w:t>
-              <w:br/>
-            </w:r>
-            <w:r>
-              <w:rPr>
-                <w:b w:val="0"/>
-                <w:color w:val="555555"/>
-                <w:sz w:val="14"/>
-              </w:rPr>
-              <w:t>Mandalay University</w:t>
-              <w:br/>
-              <w:t>2011–2016</w:t>
-            </w:r>
-          </w:p>
-        </w:tc>
-        <w:tc>
-          <w:tcPr>
-            <w:tcW w:type="dxa" w:w="7370"/>
-            <w:tcBorders>
-              <w:top w:val="nil"/>
-              <w:left w:val="nil"/>
-              <w:bottom w:val="nil"/>
-              <w:right w:val="nil"/>
-            </w:tcBorders>
-          </w:tcPr>
-          <w:p>
-            <w:pPr>
-              <w:spacing w:after="0"/>
-            </w:pPr>
-          </w:p>
-          <w:p>
-            <w:pPr>
-              <w:spacing w:before="80" w:after="40"/>
-              <w:pBdr>
-                <w:bottom w:val="single" w:sz="8" w:space="1" w:color="1A2A4A"/>
-              </w:pBdr>
-            </w:pPr>
-            <w:r>
-              <w:rPr>
-                <w:b/>
-                <w:color w:val="1A2A4A"/>
-                <w:sz w:val="19"/>
-              </w:rPr>
-              <w:t>PROFESSIONAL SUMMARY</w:t>
-            </w:r>
-          </w:p>
-          <w:p>
-            <w:pPr>
-              <w:spacing w:before="0" w:after="40" w:line="269" w:lineRule="auto"/>
-            </w:pPr>
-            <w:r>
-              <w:rPr>
-                <w:b w:val="0"/>
-                <w:color w:val="555555"/>
-                <w:sz w:val="16"/>
-              </w:rPr>
-              <w:t>Senior Network Engineer with 13+ years of experience in ISP core networks, routing protocols, MPLS, and service provider infrastructure. Specialized in BGP/OSPF/IS-IS, MPLS VPN, data center networking, and large-scale network design. Proven track record operating nationwide backbone networks and leading critical escalation response.</w:t>
-            </w:r>
-          </w:p>
-          <w:p>
-            <w:pPr>
-              <w:spacing w:before="80" w:after="40"/>
-              <w:pBdr>
-                <w:bottom w:val="single" w:sz="8" w:space="1" w:color="1A2A4A"/>
-              </w:pBdr>
-            </w:pPr>
-            <w:r>
-              <w:rPr>
-                <w:b/>
-                <w:color w:val="1A2A4A"/>
-                <w:sz w:val="19"/>
-              </w:rPr>
-              <w:t>EXPERIENCE</w:t>
-            </w:r>
-          </w:p>
-          <w:p>
-            <w:pPr>
-              <w:spacing w:before="60" w:after="0"/>
-            </w:pPr>
-            <w:r>
-              <w:rPr>
-                <w:b/>
-                <w:color w:val="1A2A4A"/>
-                <w:sz w:val="18"/>
-              </w:rPr>
-              <w:t>Network &amp; Solution Engineer</w:t>
-            </w:r>
-            <w:r>
-              <w:rPr>
-                <w:sz w:val="2"/>
-              </w:rPr>
-              <w:tab/>
-            </w:r>
-            <w:r>
-              <w:rPr>
-                <w:b w:val="0"/>
-                <w:color w:val="999999"/>
-                <w:sz w:val="14"/>
-              </w:rPr>
-              <w:t>Jun 2024 – Present</w:t>
-            </w:r>
-          </w:p>
-          <w:p>
-            <w:pPr>
-              <w:spacing w:before="0" w:after="20"/>
-            </w:pPr>
-            <w:r>
-              <w:rPr>
-                <w:b w:val="0"/>
-                <w:color w:val="4A6A8A"/>
-                <w:sz w:val="16"/>
-              </w:rPr>
-              <w:t>Planetcomm / Planetcloud, Bangkok, Thailand</w:t>
-            </w:r>
-          </w:p>
-          <w:p>
-            <w:pPr>
-              <w:spacing w:before="0" w:after="0"/>
-              <w:ind w:left="227" w:hanging="170"/>
-            </w:pPr>
-            <w:r>
-              <w:rPr>
-                <w:b w:val="0"/>
-                <w:color w:val="555555"/>
-                <w:sz w:val="14"/>
-              </w:rPr>
-              <w:t>▸ Engineered multi-tenant network architecture (VLANs, VPNs, firewalls, routing) ensuring isolation and scalability</w:t>
-            </w:r>
-          </w:p>
-          <w:p>
-            <w:pPr>
-              <w:spacing w:before="0" w:after="0"/>
-              <w:ind w:left="227" w:hanging="170"/>
-            </w:pPr>
-            <w:r>
-              <w:rPr>
-                <w:b w:val="0"/>
-                <w:color w:val="555555"/>
-                <w:sz w:val="14"/>
-              </w:rPr>
-              <w:t>▸ Applied Cisco ACI for policy-driven data center networking</w:t>
-            </w:r>
-          </w:p>
-          <w:p>
-            <w:pPr>
-              <w:spacing w:before="0" w:after="0"/>
-              <w:ind w:left="227" w:hanging="170"/>
-            </w:pPr>
-            <w:r>
-              <w:rPr>
-                <w:b w:val="0"/>
-                <w:color w:val="555555"/>
-                <w:sz w:val="14"/>
-              </w:rPr>
-              <w:t>▸ Delivered Smart City network solutions integrating video surveillance, IoT, and central management</w:t>
-            </w:r>
-          </w:p>
-          <w:p>
-            <w:pPr>
-              <w:spacing w:before="0" w:after="0"/>
-              <w:ind w:left="227" w:hanging="170"/>
-            </w:pPr>
-            <w:r>
-              <w:rPr>
-                <w:b w:val="0"/>
-                <w:color w:val="555555"/>
-                <w:sz w:val="14"/>
-              </w:rPr>
-              <w:t>▸ Designed and implemented SPDC Data Center and FWaaS firewall solutions</w:t>
-            </w:r>
-          </w:p>
-          <w:p>
-            <w:pPr>
-              <w:spacing w:before="0" w:after="0"/>
-              <w:ind w:left="227" w:hanging="170"/>
-            </w:pPr>
-            <w:r>
-              <w:rPr>
-                <w:b w:val="0"/>
-                <w:color w:val="555555"/>
-                <w:sz w:val="14"/>
-              </w:rPr>
-              <w:t>▸ Collaborated with cross-vendor teams for integrated network and infrastructure deployments</w:t>
-            </w:r>
-          </w:p>
-          <w:p>
-            <w:pPr>
-              <w:spacing w:before="60" w:after="0"/>
-            </w:pPr>
-            <w:r>
-              <w:rPr>
-                <w:b/>
-                <w:color w:val="1A2A4A"/>
-                <w:sz w:val="18"/>
-              </w:rPr>
-              <w:t>Senior Core Network Engineer</w:t>
-            </w:r>
-            <w:r>
-              <w:rPr>
-                <w:sz w:val="2"/>
-              </w:rPr>
-              <w:tab/>
-            </w:r>
-            <w:r>
-              <w:rPr>
-                <w:b w:val="0"/>
-                <w:color w:val="999999"/>
-                <w:sz w:val="14"/>
-              </w:rPr>
-              <w:t>Dec 2011 – Jun 2024</w:t>
-            </w:r>
-          </w:p>
-          <w:p>
-            <w:pPr>
-              <w:spacing w:before="0" w:after="20"/>
-            </w:pPr>
-            <w:r>
-              <w:rPr>
-                <w:b w:val="0"/>
-                <w:color w:val="4A6A8A"/>
-                <w:sz w:val="16"/>
-              </w:rPr>
-              <w:t>Global Technology Co., Ltd., Myanmar</w:t>
-            </w:r>
-          </w:p>
-          <w:p>
-            <w:pPr>
-              <w:spacing w:before="0" w:after="0"/>
-              <w:ind w:left="227" w:hanging="170"/>
-            </w:pPr>
-            <w:r>
-              <w:rPr>
-                <w:b w:val="0"/>
-                <w:color w:val="555555"/>
-                <w:sz w:val="14"/>
-              </w:rPr>
-              <w:t>▸ Operated nationwide ISP core network infrastructure supporting millions of users</w:t>
-            </w:r>
-          </w:p>
-          <w:p>
-            <w:pPr>
-              <w:spacing w:before="0" w:after="0"/>
-              <w:ind w:left="227" w:hanging="170"/>
-            </w:pPr>
-            <w:r>
-              <w:rPr>
-                <w:b w:val="0"/>
-                <w:color w:val="555555"/>
-                <w:sz w:val="14"/>
-              </w:rPr>
-              <w:t>▸ Designed and implemented IP Transit, MPLS VPN, FTTH, DIA, and WAN services</w:t>
-            </w:r>
-          </w:p>
-          <w:p>
-            <w:pPr>
-              <w:spacing w:before="0" w:after="0"/>
-              <w:ind w:left="227" w:hanging="170"/>
-            </w:pPr>
-            <w:r>
-              <w:rPr>
-                <w:b w:val="0"/>
-                <w:color w:val="555555"/>
-                <w:sz w:val="14"/>
-              </w:rPr>
-              <w:t>▸ Led L2/L3 escalation response for critical nationwide network outages</w:t>
-            </w:r>
-          </w:p>
-          <w:p>
-            <w:pPr>
-              <w:spacing w:before="0" w:after="0"/>
-              <w:ind w:left="227" w:hanging="170"/>
-            </w:pPr>
-            <w:r>
-              <w:rPr>
-                <w:b w:val="0"/>
-                <w:color w:val="555555"/>
-                <w:sz w:val="14"/>
-              </w:rPr>
-              <w:t>▸ Built International Gateway networks with eBGP/iBGP peering and global CDNs (Google, Facebook, Netflix)</w:t>
-            </w:r>
-          </w:p>
-          <w:p>
-            <w:pPr>
-              <w:spacing w:before="0" w:after="0"/>
-              <w:ind w:left="227" w:hanging="170"/>
-            </w:pPr>
-            <w:r>
-              <w:rPr>
-                <w:b w:val="0"/>
-                <w:color w:val="555555"/>
-                <w:sz w:val="14"/>
-              </w:rPr>
-              <w:t>▸ Deployed MPLS core network using IS-IS, MP-BGP, Traffic Engineering, and QoS</w:t>
-            </w:r>
-          </w:p>
-          <w:p>
-            <w:pPr>
-              <w:spacing w:before="0" w:after="0"/>
-              <w:ind w:left="227" w:hanging="170"/>
-            </w:pPr>
-            <w:r>
-              <w:rPr>
-                <w:b w:val="0"/>
-                <w:color w:val="555555"/>
-                <w:sz w:val="14"/>
-              </w:rPr>
-              <w:t>▸ Conducted capacity planning and 160G–400G backbone upgrades</w:t>
-            </w:r>
-          </w:p>
-          <w:p>
-            <w:pPr>
-              <w:spacing w:before="0" w:after="0"/>
-              <w:ind w:left="227" w:hanging="170"/>
-            </w:pPr>
-            <w:r>
-              <w:rPr>
-                <w:b w:val="0"/>
-                <w:color w:val="555555"/>
-                <w:sz w:val="14"/>
-              </w:rPr>
-              <w:t>▸ Expanded POP sites and multi-service platforms for high availability and redundancy</w:t>
-            </w:r>
-          </w:p>
-          <w:p>
-            <w:pPr>
-              <w:spacing w:before="60" w:after="0"/>
-            </w:pPr>
-            <w:r>
-              <w:rPr>
-                <w:b/>
-                <w:color w:val="1A2A4A"/>
-                <w:sz w:val="18"/>
-              </w:rPr>
-              <w:t>Smart City &amp; Network Projects</w:t>
-            </w:r>
-            <w:r>
-              <w:rPr>
-                <w:sz w:val="2"/>
-              </w:rPr>
-              <w:tab/>
-            </w:r>
-            <w:r>
-              <w:rPr>
-                <w:b w:val="0"/>
-                <w:color w:val="999999"/>
-                <w:sz w:val="14"/>
-              </w:rPr>
-              <w:t>2018 – Present</w:t>
-            </w:r>
-          </w:p>
-          <w:p>
-            <w:pPr>
-              <w:spacing w:before="0" w:after="20"/>
-            </w:pPr>
-            <w:r>
-              <w:rPr>
-                <w:b w:val="0"/>
-                <w:color w:val="4A6A8A"/>
-                <w:sz w:val="16"/>
-              </w:rPr>
-              <w:t>Various Projects</w:t>
-            </w:r>
-          </w:p>
-          <w:p>
-            <w:pPr>
-              <w:spacing w:before="0" w:after="0"/>
-              <w:ind w:left="227" w:hanging="170"/>
-            </w:pPr>
-            <w:r>
-              <w:rPr>
-                <w:b w:val="0"/>
-                <w:color w:val="555555"/>
-                <w:sz w:val="14"/>
-              </w:rPr>
-              <w:t>▸ Designed Smart City network infrastructure for urban surveillance and IoT integration</w:t>
-            </w:r>
-          </w:p>
-          <w:p>
-            <w:pPr>
-              <w:spacing w:before="0" w:after="0"/>
-              <w:ind w:left="227" w:hanging="170"/>
-            </w:pPr>
-            <w:r>
-              <w:rPr>
-                <w:b w:val="0"/>
-                <w:color w:val="555555"/>
-                <w:sz w:val="14"/>
-              </w:rPr>
-              <w:t>▸ Built secure, high-availability connectivity between edge devices, data centers, and private clouds</w:t>
-            </w:r>
-          </w:p>
-          <w:p>
-            <w:pPr>
-              <w:spacing w:before="80" w:after="40"/>
-              <w:pBdr>
-                <w:bottom w:val="single" w:sz="8" w:space="1" w:color="1A2A4A"/>
-              </w:pBdr>
-            </w:pPr>
-            <w:r>
-              <w:rPr>
-                <w:b/>
-                <w:color w:val="1A2A4A"/>
-                <w:sz w:val="19"/>
-              </w:rPr>
-              <w:t>CERTIFICATIONS &amp; TRAINING</w:t>
-            </w:r>
-          </w:p>
-          <w:p>
-            <w:pPr>
-              <w:spacing w:before="0" w:after="20"/>
-              <w:ind w:left="170" w:hanging="113"/>
-            </w:pPr>
-            <w:r>
-              <w:rPr>
-                <w:b w:val="0"/>
-                <w:color w:val="4A6A8A"/>
-                <w:sz w:val="14"/>
-              </w:rPr>
-              <w:t xml:space="preserve">▸ </w:t>
-            </w:r>
-            <w:r>
-              <w:rPr>
-                <w:b/>
-                <w:color w:val="1A2A4A"/>
-                <w:sz w:val="14"/>
-              </w:rPr>
-              <w:t>Cisco Certified Specialist – ENARSI</w:t>
-            </w:r>
-            <w:r>
-              <w:rPr>
-                <w:b w:val="0"/>
-                <w:color w:val="555555"/>
-                <w:sz w:val="14"/>
-              </w:rPr>
-              <w:t xml:space="preserve">  —  Cisco Certified</w:t>
-            </w:r>
-          </w:p>
-          <w:p>
-            <w:pPr>
-              <w:spacing w:before="0" w:after="20"/>
-              <w:ind w:left="170" w:hanging="113"/>
-            </w:pPr>
-            <w:r>
-              <w:rPr>
-                <w:b w:val="0"/>
-                <w:color w:val="4A6A8A"/>
-                <w:sz w:val="14"/>
-              </w:rPr>
-              <w:t xml:space="preserve">▸ </w:t>
-            </w:r>
-            <w:r>
-              <w:rPr>
-                <w:b/>
-                <w:color w:val="1A2A4A"/>
-                <w:sz w:val="14"/>
-              </w:rPr>
-              <w:t>CCIE Service Provider</w:t>
-            </w:r>
-            <w:r>
-              <w:rPr>
-                <w:b w:val="0"/>
-                <w:color w:val="555555"/>
-                <w:sz w:val="14"/>
-              </w:rPr>
-              <w:t xml:space="preserve">  —  Training</w:t>
-            </w:r>
-          </w:p>
-          <w:p>
-            <w:pPr>
-              <w:spacing w:before="0" w:after="20"/>
-              <w:ind w:left="170" w:hanging="113"/>
-            </w:pPr>
-            <w:r>
-              <w:rPr>
-                <w:b w:val="0"/>
-                <w:color w:val="4A6A8A"/>
-                <w:sz w:val="14"/>
-              </w:rPr>
-              <w:t xml:space="preserve">▸ </w:t>
-            </w:r>
-            <w:r>
-              <w:rPr>
-                <w:b/>
-                <w:color w:val="1A2A4A"/>
-                <w:sz w:val="14"/>
-              </w:rPr>
-              <w:t>CCIE Enterprise Infrastructure</w:t>
-            </w:r>
-            <w:r>
-              <w:rPr>
-                <w:b w:val="0"/>
-                <w:color w:val="555555"/>
-                <w:sz w:val="14"/>
-              </w:rPr>
-              <w:t xml:space="preserve">  —  Training</w:t>
-            </w:r>
-          </w:p>
-          <w:p>
-            <w:pPr>
-              <w:spacing w:before="0" w:after="20"/>
-              <w:ind w:left="170" w:hanging="113"/>
-            </w:pPr>
-            <w:r>
-              <w:rPr>
-                <w:b w:val="0"/>
-                <w:color w:val="4A6A8A"/>
-                <w:sz w:val="14"/>
-              </w:rPr>
-              <w:t xml:space="preserve">▸ </w:t>
-            </w:r>
-            <w:r>
-              <w:rPr>
-                <w:b/>
-                <w:color w:val="1A2A4A"/>
-                <w:sz w:val="14"/>
-              </w:rPr>
-              <w:t>CCNP Routing &amp; Switching</w:t>
-            </w:r>
-            <w:r>
-              <w:rPr>
-                <w:b w:val="0"/>
-                <w:color w:val="555555"/>
-                <w:sz w:val="14"/>
-              </w:rPr>
-              <w:t xml:space="preserve">  —  Training</w:t>
-            </w:r>
-          </w:p>
-          <w:p>
-            <w:pPr>
-              <w:spacing w:before="80" w:after="40"/>
-              <w:pBdr>
-                <w:bottom w:val="single" w:sz="8" w:space="1" w:color="1A2A4A"/>
-              </w:pBdr>
-            </w:pPr>
-            <w:r>
-              <w:rPr>
-                <w:b/>
-                <w:color w:val="1A2A4A"/>
-                <w:sz w:val="19"/>
-              </w:rPr>
-              <w:t>HANDS-ON EQUIPMENT</w:t>
-            </w:r>
-          </w:p>
-          <w:p>
-            <w:pPr>
-              <w:spacing w:before="0" w:after="40" w:line="269" w:lineRule="auto"/>
-            </w:pPr>
-            <w:r>
-              <w:rPr>
-                <w:b w:val="0"/>
-                <w:color w:val="555555"/>
-                <w:sz w:val="16"/>
-              </w:rPr>
-              <w:t>Cisco ASR9K, NCS 5500/6000, Juniper MX, Nexus 9K/7K/5K/2K, Catalyst 9K, Cisco UCS, Cisco ACI, Cisco FMC/FTD/ASA, FortiGate, MikroTik, Zabbix</w:t>
-            </w:r>
-          </w:p>
-        </w:tc>
-      </w:tr>
-    </w:tbl>
+    <w:p>
+      <w:pPr>
+        <w:jc w:val="left"/>
+      </w:pPr>
+      <w:r>
+        <w:rPr>
+          <w:b/>
+          <w:color w:val="1A2A4A"/>
+          <w:sz w:val="44"/>
+        </w:rPr>
+        <w:t>YAN NAING KYAW</w:t>
+      </w:r>
+    </w:p>
+    <w:p>
+      <w:pPr>
+        <w:spacing w:before="0" w:after="40"/>
+      </w:pPr>
+      <w:r>
+        <w:rPr>
+          <w:b w:val="0"/>
+          <w:color w:val="4A6A8A"/>
+          <w:sz w:val="22"/>
+        </w:rPr>
+        <w:t>Senior Network &amp; Solution Engineer</w:t>
+      </w:r>
+    </w:p>
+    <w:p>
+      <w:pPr>
+        <w:spacing w:before="40" w:after="120"/>
+      </w:pPr>
+      <w:r>
+        <w:rPr>
+          <w:b w:val="0"/>
+          <w:color w:val="999999"/>
+          <w:sz w:val="17"/>
+        </w:rPr>
+        <w:t>✉ ynk.engineer@gmail.com  |  📞 +66 06-3327-5176  |  🔗 linkedin.com/in/yann-naing-kyaw-3ba69a10a</w:t>
+      </w:r>
+    </w:p>
+    <w:p>
+      <w:pPr>
+        <w:spacing w:before="0" w:after="160"/>
+      </w:pPr>
+      <w:r>
+        <w:rPr>
+          <w:b w:val="0"/>
+          <w:color w:val="999999"/>
+          <w:sz w:val="17"/>
+        </w:rPr>
+        <w:t>🌐 yannaingkyaw.github.io/portfolio  |  📍 Bangkok, Thailand</w:t>
+      </w:r>
+    </w:p>
+    <w:p>
+      <w:pPr>
+        <w:spacing w:before="0" w:after="0"/>
+        <w:pBdr>
+          <w:bottom w:val="single" w:sz="12" w:space="1" w:color="1A2A4A"/>
+        </w:pBdr>
+      </w:pPr>
+    </w:p>
+    <w:p>
+      <w:pPr>
+        <w:spacing w:before="280" w:after="80"/>
+        <w:pBdr>
+          <w:bottom w:val="single" w:sz="8" w:space="1" w:color="1A2A4A"/>
+        </w:pBdr>
+      </w:pPr>
+      <w:r>
+        <w:rPr>
+          <w:b/>
+          <w:color w:val="1A2A4A"/>
+          <w:sz w:val="20"/>
+        </w:rPr>
+        <w:t>PROFESSIONAL SUMMARY</w:t>
+      </w:r>
+    </w:p>
+    <w:p>
+      <w:pPr>
+        <w:spacing w:before="0" w:after="80" w:line="276" w:lineRule="auto"/>
+      </w:pPr>
+      <w:r>
+        <w:rPr>
+          <w:b w:val="0"/>
+          <w:color w:val="555555"/>
+          <w:sz w:val="18"/>
+        </w:rPr>
+        <w:t>Senior Network Engineer with 13+ years of experience in ISP core networks, routing protocols, MPLS, and service provider infrastructure. Specialized in BGP/OSPF/IS-IS, MPLS VPN, data center networking, and large-scale network design. Proven track record operating nationwide backbone networks and leading critical escalation response.</w:t>
+      </w:r>
+    </w:p>
+    <w:p>
+      <w:pPr>
+        <w:spacing w:before="280" w:after="80"/>
+        <w:pBdr>
+          <w:bottom w:val="single" w:sz="8" w:space="1" w:color="1A2A4A"/>
+        </w:pBdr>
+      </w:pPr>
+      <w:r>
+        <w:rPr>
+          <w:b/>
+          <w:color w:val="1A2A4A"/>
+          <w:sz w:val="20"/>
+        </w:rPr>
+        <w:t>CORE SKILLS</w:t>
+      </w:r>
+    </w:p>
+    <w:p>
+      <w:pPr>
+        <w:spacing w:before="0" w:after="40"/>
+      </w:pPr>
+      <w:r>
+        <w:rPr>
+          <w:b/>
+          <w:color w:val="1A2A4A"/>
+          <w:sz w:val="17"/>
+        </w:rPr>
+        <w:t xml:space="preserve">Routing &amp; Switching: </w:t>
+      </w:r>
+      <w:r>
+        <w:rPr>
+          <w:b w:val="0"/>
+          <w:color w:val="555555"/>
+          <w:sz w:val="17"/>
+        </w:rPr>
+        <w:t>BGP, OSPF, IS-IS, MP-BGP, L2/L3 Design, VLAN, STP</w:t>
+      </w:r>
+      <w:r>
+        <w:rPr>
+          <w:b w:val="0"/>
+          <w:color w:val="DDDDDD"/>
+          <w:sz w:val="17"/>
+        </w:rPr>
+        <w:t xml:space="preserve">    |    </w:t>
+      </w:r>
+      <w:r>
+        <w:rPr>
+          <w:b/>
+          <w:color w:val="1A2A4A"/>
+          <w:sz w:val="17"/>
+        </w:rPr>
+        <w:t xml:space="preserve">MPLS &amp; WAN: </w:t>
+      </w:r>
+      <w:r>
+        <w:rPr>
+          <w:b w:val="0"/>
+          <w:color w:val="555555"/>
+          <w:sz w:val="17"/>
+        </w:rPr>
+        <w:t>MPLS, MPLS VPN, TE, QoS, SD-WAN, VPN, IP Transit</w:t>
+      </w:r>
+    </w:p>
+    <w:p>
+      <w:pPr>
+        <w:spacing w:before="0" w:after="40"/>
+      </w:pPr>
+      <w:r>
+        <w:rPr>
+          <w:b/>
+          <w:color w:val="1A2A4A"/>
+          <w:sz w:val="17"/>
+        </w:rPr>
+        <w:t xml:space="preserve">Service Provider: </w:t>
+      </w:r>
+      <w:r>
+        <w:rPr>
+          <w:b w:val="0"/>
+          <w:color w:val="555555"/>
+          <w:sz w:val="17"/>
+        </w:rPr>
+        <w:t>FTTH, DIA, IGW, eBGP/iBGP, CDN Peering, Capacity Planning</w:t>
+      </w:r>
+      <w:r>
+        <w:rPr>
+          <w:b w:val="0"/>
+          <w:color w:val="DDDDDD"/>
+          <w:sz w:val="17"/>
+        </w:rPr>
+        <w:t xml:space="preserve">    |    </w:t>
+      </w:r>
+      <w:r>
+        <w:rPr>
+          <w:b/>
+          <w:color w:val="1A2A4A"/>
+          <w:sz w:val="17"/>
+        </w:rPr>
+        <w:t xml:space="preserve">Security: </w:t>
+      </w:r>
+      <w:r>
+        <w:rPr>
+          <w:b w:val="0"/>
+          <w:color w:val="555555"/>
+          <w:sz w:val="17"/>
+        </w:rPr>
+        <w:t>Cisco FTD/ASA/FMC, FortiGate</w:t>
+      </w:r>
+    </w:p>
+    <w:p>
+      <w:pPr>
+        <w:spacing w:before="0" w:after="40"/>
+      </w:pPr>
+      <w:r>
+        <w:rPr>
+          <w:b/>
+          <w:color w:val="1A2A4A"/>
+          <w:sz w:val="17"/>
+        </w:rPr>
+        <w:t xml:space="preserve">Data Center: </w:t>
+      </w:r>
+      <w:r>
+        <w:rPr>
+          <w:b w:val="0"/>
+          <w:color w:val="555555"/>
+          <w:sz w:val="17"/>
+        </w:rPr>
+        <w:t>Cisco ACI, Nexus, UCS, FWaaS</w:t>
+      </w:r>
+      <w:r>
+        <w:rPr>
+          <w:b w:val="0"/>
+          <w:color w:val="DDDDDD"/>
+          <w:sz w:val="17"/>
+        </w:rPr>
+        <w:t xml:space="preserve">    |    </w:t>
+      </w:r>
+      <w:r>
+        <w:rPr>
+          <w:b/>
+          <w:color w:val="1A2A4A"/>
+          <w:sz w:val="17"/>
+        </w:rPr>
+        <w:t xml:space="preserve">Monitoring &amp; Voice: </w:t>
+      </w:r>
+      <w:r>
+        <w:rPr>
+          <w:b w:val="0"/>
+          <w:color w:val="555555"/>
+          <w:sz w:val="17"/>
+        </w:rPr>
+        <w:t>Zabbix, SNMP, Cacti, VoIP/SIP</w:t>
+      </w:r>
+    </w:p>
+    <w:p>
+      <w:pPr>
+        <w:spacing w:before="280" w:after="80"/>
+        <w:pBdr>
+          <w:bottom w:val="single" w:sz="8" w:space="1" w:color="1A2A4A"/>
+        </w:pBdr>
+      </w:pPr>
+      <w:r>
+        <w:rPr>
+          <w:b/>
+          <w:color w:val="1A2A4A"/>
+          <w:sz w:val="20"/>
+        </w:rPr>
+        <w:t>EXPERIENCE</w:t>
+      </w:r>
+    </w:p>
+    <w:p>
+      <w:pPr>
+        <w:spacing w:before="160" w:after="0"/>
+      </w:pPr>
+      <w:r>
+        <w:rPr>
+          <w:b/>
+          <w:color w:val="1A2A4A"/>
+          <w:sz w:val="20"/>
+        </w:rPr>
+        <w:t>Network &amp; Solution Engineer</w:t>
+      </w:r>
+      <w:r>
+        <w:rPr>
+          <w:b w:val="0"/>
+          <w:color w:val="999999"/>
+          <w:sz w:val="16"/>
+        </w:rPr>
+        <w:t xml:space="preserve">    Jun 2024 – Present</w:t>
+      </w:r>
+    </w:p>
+    <w:p>
+      <w:pPr>
+        <w:spacing w:before="0" w:after="40"/>
+      </w:pPr>
+      <w:r>
+        <w:rPr>
+          <w:b w:val="0"/>
+          <w:color w:val="4A6A8A"/>
+          <w:sz w:val="18"/>
+        </w:rPr>
+        <w:t>Planetcomm / Planetcloud, Bangkok, Thailand</w:t>
+      </w:r>
+    </w:p>
+    <w:p>
+      <w:pPr>
+        <w:spacing w:before="0" w:after="20"/>
+        <w:ind w:left="283" w:hanging="170"/>
+      </w:pPr>
+      <w:r>
+        <w:rPr>
+          <w:b w:val="0"/>
+          <w:color w:val="555555"/>
+          <w:sz w:val="17"/>
+        </w:rPr>
+        <w:t>▸  Engineered multi-tenant network architecture (VLANs, VPNs, firewalls, routing) ensuring isolation and scalability</w:t>
+      </w:r>
+    </w:p>
+    <w:p>
+      <w:pPr>
+        <w:spacing w:before="0" w:after="20"/>
+        <w:ind w:left="283" w:hanging="170"/>
+      </w:pPr>
+      <w:r>
+        <w:rPr>
+          <w:b w:val="0"/>
+          <w:color w:val="555555"/>
+          <w:sz w:val="17"/>
+        </w:rPr>
+        <w:t>▸  Applied Cisco ACI for policy-driven data center networking</w:t>
+      </w:r>
+    </w:p>
+    <w:p>
+      <w:pPr>
+        <w:spacing w:before="0" w:after="20"/>
+        <w:ind w:left="283" w:hanging="170"/>
+      </w:pPr>
+      <w:r>
+        <w:rPr>
+          <w:b w:val="0"/>
+          <w:color w:val="555555"/>
+          <w:sz w:val="17"/>
+        </w:rPr>
+        <w:t>▸  Delivered Smart City network solutions integrating video surveillance, IoT, and central management</w:t>
+      </w:r>
+    </w:p>
+    <w:p>
+      <w:pPr>
+        <w:spacing w:before="0" w:after="20"/>
+        <w:ind w:left="283" w:hanging="170"/>
+      </w:pPr>
+      <w:r>
+        <w:rPr>
+          <w:b w:val="0"/>
+          <w:color w:val="555555"/>
+          <w:sz w:val="17"/>
+        </w:rPr>
+        <w:t>▸  Designed and implemented SPDC Data Center and FWaaS firewall solutions</w:t>
+      </w:r>
+    </w:p>
+    <w:p>
+      <w:pPr>
+        <w:spacing w:before="0" w:after="20"/>
+        <w:ind w:left="283" w:hanging="170"/>
+      </w:pPr>
+      <w:r>
+        <w:rPr>
+          <w:b w:val="0"/>
+          <w:color w:val="555555"/>
+          <w:sz w:val="17"/>
+        </w:rPr>
+        <w:t>▸  Collaborated with cross-vendor teams for integrated network and infrastructure deployments</w:t>
+      </w:r>
+    </w:p>
+    <w:p>
+      <w:pPr>
+        <w:spacing w:before="160" w:after="0"/>
+      </w:pPr>
+      <w:r>
+        <w:rPr>
+          <w:b/>
+          <w:color w:val="1A2A4A"/>
+          <w:sz w:val="20"/>
+        </w:rPr>
+        <w:t>Senior Core Network Engineer</w:t>
+      </w:r>
+      <w:r>
+        <w:rPr>
+          <w:b w:val="0"/>
+          <w:color w:val="999999"/>
+          <w:sz w:val="16"/>
+        </w:rPr>
+        <w:t xml:space="preserve">    Dec 2011 – Jun 2024</w:t>
+      </w:r>
+    </w:p>
+    <w:p>
+      <w:pPr>
+        <w:spacing w:before="0" w:after="40"/>
+      </w:pPr>
+      <w:r>
+        <w:rPr>
+          <w:b w:val="0"/>
+          <w:color w:val="4A6A8A"/>
+          <w:sz w:val="18"/>
+        </w:rPr>
+        <w:t>Global Technology Co., Ltd., Myanmar</w:t>
+      </w:r>
+    </w:p>
+    <w:p>
+      <w:pPr>
+        <w:spacing w:before="0" w:after="20"/>
+        <w:ind w:left="283" w:hanging="170"/>
+      </w:pPr>
+      <w:r>
+        <w:rPr>
+          <w:b w:val="0"/>
+          <w:color w:val="555555"/>
+          <w:sz w:val="17"/>
+        </w:rPr>
+        <w:t>▸  Operated nationwide ISP core network infrastructure supporting millions of users</w:t>
+      </w:r>
+    </w:p>
+    <w:p>
+      <w:pPr>
+        <w:spacing w:before="0" w:after="20"/>
+        <w:ind w:left="283" w:hanging="170"/>
+      </w:pPr>
+      <w:r>
+        <w:rPr>
+          <w:b w:val="0"/>
+          <w:color w:val="555555"/>
+          <w:sz w:val="17"/>
+        </w:rPr>
+        <w:t>▸  Designed and implemented IP Transit, MPLS VPN, FTTH, DIA, and WAN services</w:t>
+      </w:r>
+    </w:p>
+    <w:p>
+      <w:pPr>
+        <w:spacing w:before="0" w:after="20"/>
+        <w:ind w:left="283" w:hanging="170"/>
+      </w:pPr>
+      <w:r>
+        <w:rPr>
+          <w:b w:val="0"/>
+          <w:color w:val="555555"/>
+          <w:sz w:val="17"/>
+        </w:rPr>
+        <w:t>▸  Led L2/L3 escalation response for critical nationwide network outages</w:t>
+      </w:r>
+    </w:p>
+    <w:p>
+      <w:pPr>
+        <w:spacing w:before="0" w:after="20"/>
+        <w:ind w:left="283" w:hanging="170"/>
+      </w:pPr>
+      <w:r>
+        <w:rPr>
+          <w:b w:val="0"/>
+          <w:color w:val="555555"/>
+          <w:sz w:val="17"/>
+        </w:rPr>
+        <w:t>▸  Built International Gateway networks with eBGP/iBGP peering and global CDNs (Google, Facebook, Netflix)</w:t>
+      </w:r>
+    </w:p>
+    <w:p>
+      <w:pPr>
+        <w:spacing w:before="0" w:after="20"/>
+        <w:ind w:left="283" w:hanging="170"/>
+      </w:pPr>
+      <w:r>
+        <w:rPr>
+          <w:b w:val="0"/>
+          <w:color w:val="555555"/>
+          <w:sz w:val="17"/>
+        </w:rPr>
+        <w:t>▸  Deployed MPLS core network using IS-IS, MP-BGP, Traffic Engineering, and QoS</w:t>
+      </w:r>
+    </w:p>
+    <w:p>
+      <w:pPr>
+        <w:spacing w:before="0" w:after="20"/>
+        <w:ind w:left="283" w:hanging="170"/>
+      </w:pPr>
+      <w:r>
+        <w:rPr>
+          <w:b w:val="0"/>
+          <w:color w:val="555555"/>
+          <w:sz w:val="17"/>
+        </w:rPr>
+        <w:t>▸  Conducted capacity planning and 160G–400G backbone upgrades</w:t>
+      </w:r>
+    </w:p>
+    <w:p>
+      <w:pPr>
+        <w:spacing w:before="0" w:after="20"/>
+        <w:ind w:left="283" w:hanging="170"/>
+      </w:pPr>
+      <w:r>
+        <w:rPr>
+          <w:b w:val="0"/>
+          <w:color w:val="555555"/>
+          <w:sz w:val="17"/>
+        </w:rPr>
+        <w:t>▸  Expanded POP sites and multi-service platforms for high availability and redundancy</w:t>
+      </w:r>
+    </w:p>
+    <w:p>
+      <w:pPr>
+        <w:spacing w:before="160" w:after="0"/>
+      </w:pPr>
+      <w:r>
+        <w:rPr>
+          <w:b/>
+          <w:color w:val="1A2A4A"/>
+          <w:sz w:val="20"/>
+        </w:rPr>
+        <w:t>Smart City &amp; Network Projects</w:t>
+      </w:r>
+      <w:r>
+        <w:rPr>
+          <w:b w:val="0"/>
+          <w:color w:val="999999"/>
+          <w:sz w:val="16"/>
+        </w:rPr>
+        <w:t xml:space="preserve">    2018 – Present</w:t>
+      </w:r>
+    </w:p>
+    <w:p>
+      <w:pPr>
+        <w:spacing w:before="0" w:after="40"/>
+      </w:pPr>
+      <w:r>
+        <w:rPr>
+          <w:b w:val="0"/>
+          <w:color w:val="4A6A8A"/>
+          <w:sz w:val="18"/>
+        </w:rPr>
+        <w:t>Various Projects</w:t>
+      </w:r>
+    </w:p>
+    <w:p>
+      <w:pPr>
+        <w:spacing w:before="0" w:after="20"/>
+        <w:ind w:left="283" w:hanging="170"/>
+      </w:pPr>
+      <w:r>
+        <w:rPr>
+          <w:b w:val="0"/>
+          <w:color w:val="555555"/>
+          <w:sz w:val="17"/>
+        </w:rPr>
+        <w:t>▸  Designed Smart City network infrastructure for urban surveillance and IoT integration</w:t>
+      </w:r>
+    </w:p>
+    <w:p>
+      <w:pPr>
+        <w:spacing w:before="0" w:after="20"/>
+        <w:ind w:left="283" w:hanging="170"/>
+      </w:pPr>
+      <w:r>
+        <w:rPr>
+          <w:b w:val="0"/>
+          <w:color w:val="555555"/>
+          <w:sz w:val="17"/>
+        </w:rPr>
+        <w:t>▸  Built secure, high-availability connectivity between edge devices, data centers, and private clouds</w:t>
+      </w:r>
+    </w:p>
+    <w:p>
+      <w:r>
+        <w:br w:type="page"/>
+      </w:r>
+    </w:p>
+    <w:p>
+      <w:pPr>
+        <w:spacing w:before="280" w:after="80"/>
+        <w:pBdr>
+          <w:bottom w:val="single" w:sz="8" w:space="1" w:color="1A2A4A"/>
+        </w:pBdr>
+      </w:pPr>
+      <w:r>
+        <w:rPr>
+          <w:b/>
+          <w:color w:val="1A2A4A"/>
+          <w:sz w:val="20"/>
+        </w:rPr>
+        <w:t>CERTIFICATIONS &amp; TRAINING</w:t>
+      </w:r>
+    </w:p>
+    <w:p>
+      <w:pPr>
+        <w:spacing w:before="0" w:after="40"/>
+        <w:ind w:left="283" w:hanging="170"/>
+      </w:pPr>
+      <w:r>
+        <w:rPr>
+          <w:b w:val="0"/>
+          <w:color w:val="4A6A8A"/>
+          <w:sz w:val="17"/>
+        </w:rPr>
+        <w:t xml:space="preserve">▸  </w:t>
+      </w:r>
+      <w:r>
+        <w:rPr>
+          <w:b/>
+          <w:color w:val="1A2A4A"/>
+          <w:sz w:val="17"/>
+        </w:rPr>
+        <w:t xml:space="preserve">Cisco Certified Specialist – ENARSI </w:t>
+      </w:r>
+      <w:r>
+        <w:rPr>
+          <w:b w:val="0"/>
+          <w:color w:val="555555"/>
+          <w:sz w:val="17"/>
+        </w:rPr>
+        <w:t xml:space="preserve"> —  Cisco Certified</w:t>
+      </w:r>
+    </w:p>
+    <w:p>
+      <w:pPr>
+        <w:spacing w:before="0" w:after="40"/>
+        <w:ind w:left="283" w:hanging="170"/>
+      </w:pPr>
+      <w:r>
+        <w:rPr>
+          <w:b w:val="0"/>
+          <w:color w:val="4A6A8A"/>
+          <w:sz w:val="17"/>
+        </w:rPr>
+        <w:t xml:space="preserve">▸  </w:t>
+      </w:r>
+      <w:r>
+        <w:rPr>
+          <w:b/>
+          <w:color w:val="1A2A4A"/>
+          <w:sz w:val="17"/>
+        </w:rPr>
+        <w:t xml:space="preserve">CCIE Service Provider </w:t>
+      </w:r>
+      <w:r>
+        <w:rPr>
+          <w:b w:val="0"/>
+          <w:color w:val="555555"/>
+          <w:sz w:val="17"/>
+        </w:rPr>
+        <w:t xml:space="preserve"> —  Training</w:t>
+      </w:r>
+    </w:p>
+    <w:p>
+      <w:pPr>
+        <w:spacing w:before="0" w:after="40"/>
+        <w:ind w:left="283" w:hanging="170"/>
+      </w:pPr>
+      <w:r>
+        <w:rPr>
+          <w:b w:val="0"/>
+          <w:color w:val="4A6A8A"/>
+          <w:sz w:val="17"/>
+        </w:rPr>
+        <w:t xml:space="preserve">▸  </w:t>
+      </w:r>
+      <w:r>
+        <w:rPr>
+          <w:b/>
+          <w:color w:val="1A2A4A"/>
+          <w:sz w:val="17"/>
+        </w:rPr>
+        <w:t xml:space="preserve">CCIE Enterprise Infrastructure </w:t>
+      </w:r>
+      <w:r>
+        <w:rPr>
+          <w:b w:val="0"/>
+          <w:color w:val="555555"/>
+          <w:sz w:val="17"/>
+        </w:rPr>
+        <w:t xml:space="preserve"> —  Training</w:t>
+      </w:r>
+    </w:p>
+    <w:p>
+      <w:pPr>
+        <w:spacing w:before="0" w:after="40"/>
+        <w:ind w:left="283" w:hanging="170"/>
+      </w:pPr>
+      <w:r>
+        <w:rPr>
+          <w:b w:val="0"/>
+          <w:color w:val="4A6A8A"/>
+          <w:sz w:val="17"/>
+        </w:rPr>
+        <w:t xml:space="preserve">▸  </w:t>
+      </w:r>
+      <w:r>
+        <w:rPr>
+          <w:b/>
+          <w:color w:val="1A2A4A"/>
+          <w:sz w:val="17"/>
+        </w:rPr>
+        <w:t xml:space="preserve">CCNP Routing &amp; Switching </w:t>
+      </w:r>
+      <w:r>
+        <w:rPr>
+          <w:b w:val="0"/>
+          <w:color w:val="555555"/>
+          <w:sz w:val="17"/>
+        </w:rPr>
+        <w:t xml:space="preserve"> —  Training</w:t>
+      </w:r>
+    </w:p>
+    <w:p>
+      <w:pPr>
+        <w:spacing w:before="280" w:after="80"/>
+        <w:pBdr>
+          <w:bottom w:val="single" w:sz="8" w:space="1" w:color="1A2A4A"/>
+        </w:pBdr>
+      </w:pPr>
+      <w:r>
+        <w:rPr>
+          <w:b/>
+          <w:color w:val="1A2A4A"/>
+          <w:sz w:val="20"/>
+        </w:rPr>
+        <w:t>HANDS-ON EQUIPMENT</w:t>
+      </w:r>
+    </w:p>
+    <w:p>
+      <w:pPr>
+        <w:spacing w:before="0" w:after="80" w:line="276" w:lineRule="auto"/>
+      </w:pPr>
+      <w:r>
+        <w:rPr>
+          <w:b w:val="0"/>
+          <w:color w:val="555555"/>
+          <w:sz w:val="17"/>
+        </w:rPr>
+        <w:t>Cisco ASR9K, NCS 5500/6000, Juniper MX, Nexus 9K/7K/5K/2K, Catalyst 9K, Cisco UCS, Cisco ACI, Cisco FMC/FTD/ASA, FortiGate, MikroTik, Zabbix</w:t>
+      </w:r>
+    </w:p>
+    <w:p>
+      <w:pPr>
+        <w:spacing w:before="280" w:after="80"/>
+        <w:pBdr>
+          <w:bottom w:val="single" w:sz="8" w:space="1" w:color="1A2A4A"/>
+        </w:pBdr>
+      </w:pPr>
+      <w:r>
+        <w:rPr>
+          <w:b/>
+          <w:color w:val="1A2A4A"/>
+          <w:sz w:val="20"/>
+        </w:rPr>
+        <w:t>ADDITIONAL INFO</w:t>
+      </w:r>
+    </w:p>
+    <w:p>
+      <w:pPr>
+        <w:spacing w:before="0" w:after="40"/>
+      </w:pPr>
+      <w:r>
+        <w:rPr>
+          <w:b/>
+          <w:color w:val="1A2A4A"/>
+          <w:sz w:val="18"/>
+        </w:rPr>
+        <w:t xml:space="preserve">Languages: </w:t>
+      </w:r>
+      <w:r>
+        <w:rPr>
+          <w:b w:val="0"/>
+          <w:color w:val="555555"/>
+          <w:sz w:val="18"/>
+        </w:rPr>
+        <w:t>English (Professional Working)  |  Burmese (Native)</w:t>
+      </w:r>
+    </w:p>
+    <w:p>
+      <w:pPr>
+        <w:spacing w:before="0" w:after="40"/>
+      </w:pPr>
+      <w:r>
+        <w:rPr>
+          <w:b/>
+          <w:color w:val="1A2A4A"/>
+          <w:sz w:val="18"/>
+        </w:rPr>
+        <w:t xml:space="preserve">Education: </w:t>
+      </w:r>
+      <w:r>
+        <w:rPr>
+          <w:b w:val="0"/>
+          <w:color w:val="555555"/>
+          <w:sz w:val="18"/>
+        </w:rPr>
+        <w:t>B.A. English — Mandalaya University, 2011–2016</w:t>
+      </w:r>
+    </w:p>
     <w:sectPr>
       <w:pgSz w:w="12240" w:h="15840"/>
-      <w:pgMar w:top="454" w:right="680" w:bottom="454" w:left="680" w:header="720" w:footer="720" w:gutter="0"/>
+      <w:pgMar w:top="567" w:right="1134" w:bottom="567" w:left="1134" w:header="720" w:footer="720" w:gutter="0"/>
       <w:cols w:space="720"/>
       <w:docGrid w:linePitch="360"/>
     </w:sectPr>
@@ -1375,11 +1158,11 @@
     <w:qFormat/>
     <w:rsid w:val="00FC693F"/>
     <w:pPr>
-      <w:spacing w:before="0" w:after="40" w:line="254" w:lineRule="auto"/>
+      <w:spacing w:before="0" w:after="80" w:line="276" w:lineRule="auto"/>
     </w:pPr>
     <w:rPr>
       <w:rFonts w:ascii="Calibri" w:hAnsi="Calibri"/>
-      <w:sz w:val="19"/>
+      <w:sz w:val="20"/>
     </w:rPr>
   </w:style>
   <w:style w:type="paragraph" w:styleId="Header">

</xml_diff>

<commit_message>
Original CV content restored + new navy 2-page design
</commit_message>
<xml_diff>
--- a/Yan_Naing_Kyaw_Senior_Network_Engineer.docx
+++ b/Yan_Naing_Kyaw_Senior_Network_Engineer.docx
@@ -4,6 +4,7 @@
   <w:body>
     <w:p>
       <w:pPr>
+        <w:spacing w:after="0"/>
         <w:jc w:val="left"/>
       </w:pPr>
       <w:r>
@@ -17,7 +18,7 @@
     </w:p>
     <w:p>
       <w:pPr>
-        <w:spacing w:before="0" w:after="40"/>
+        <w:spacing w:before="0" w:after="0"/>
       </w:pPr>
       <w:r>
         <w:rPr>
@@ -30,7 +31,7 @@
     </w:p>
     <w:p>
       <w:pPr>
-        <w:spacing w:before="40" w:after="120"/>
+        <w:spacing w:before="40" w:after="0"/>
       </w:pPr>
       <w:r>
         <w:rPr>
@@ -38,7 +39,7 @@
           <w:color w:val="999999"/>
           <w:sz w:val="17"/>
         </w:rPr>
-        <w:t>✉ ynk.engineer@gmail.com  |  📞 +66 06-3327-5176  |  🔗 linkedin.com/in/yann-naing-kyaw-3ba69a10a</w:t>
+        <w:t>Bangkok, Thailand  |  ynk.engineer@gmail.com  |  +66 06-3327-5176  |  Line: ynk139</w:t>
       </w:r>
     </w:p>
     <w:p>
@@ -51,7 +52,7 @@
           <w:color w:val="999999"/>
           <w:sz w:val="17"/>
         </w:rPr>
-        <w:t>🌐 yannaingkyaw.github.io/portfolio  |  📍 Bangkok, Thailand</w:t>
+        <w:t>linkedin.com/in/yann-naing-kyaw-3ba69a10a  |  yannaingkyaw.github.io/portfolio</w:t>
       </w:r>
     </w:p>
     <w:p>
@@ -86,9 +87,9 @@
         <w:rPr>
           <w:b w:val="0"/>
           <w:color w:val="555555"/>
-          <w:sz w:val="18"/>
+          <w:sz w:val="17"/>
         </w:rPr>
-        <w:t>Senior Network Engineer with 13+ years of experience in ISP core networks, routing protocols, MPLS, and service provider infrastructure. Specialized in BGP/OSPF/IS-IS, MPLS VPN, data center networking, and large-scale network design. Proven track record operating nationwide backbone networks and leading critical escalation response.</w:t>
+        <w:t>Senior Network, Cloud &amp; Infrastructure Engineer with 10+ years of experience across ISP, system integrator, private cloud, and Smart City environments. Expert in Cisco HyperFlex (HCI), VMware vCenter, Cisco UCS, Cisco ACI, and MicroCloud implementation. Proven success designing, deploying, and operating large-scale, high-availability networks and Smart City platforms integrating video surveillance, IoT, and AI analytics.</w:t>
       </w:r>
     </w:p>
     <w:p>
@@ -104,12 +105,13 @@
           <w:color w:val="1A2A4A"/>
           <w:sz w:val="20"/>
         </w:rPr>
-        <w:t>CORE SKILLS</w:t>
+        <w:t>CORE SKILLS &amp; TECHNOLOGIES</w:t>
       </w:r>
     </w:p>
     <w:p>
       <w:pPr>
-        <w:spacing w:before="0" w:after="40"/>
+        <w:spacing w:before="0" w:after="20"/>
+        <w:ind w:left="170"/>
       </w:pPr>
       <w:r>
         <w:rPr>
@@ -117,7 +119,7 @@
           <w:color w:val="1A2A4A"/>
           <w:sz w:val="17"/>
         </w:rPr>
-        <w:t xml:space="preserve">Routing &amp; Switching: </w:t>
+        <w:t xml:space="preserve">Networking: </w:t>
       </w:r>
       <w:r>
         <w:rPr>
@@ -125,23 +127,21 @@
           <w:color w:val="555555"/>
           <w:sz w:val="17"/>
         </w:rPr>
-        <w:t>BGP, OSPF, IS-IS, MP-BGP, L2/L3 Design, VLAN, STP</w:t>
+        <w:t>BGP, OSPF, IS-IS, MPLS, MP-BGP, SD-WAN, VPN, VLAN, L2/L3 design</w:t>
       </w:r>
-      <w:r>
-        <w:rPr>
-          <w:b w:val="0"/>
-          <w:color w:val="DDDDDD"/>
-          <w:sz w:val="17"/>
-        </w:rPr>
-        <w:t xml:space="preserve">    |    </w:t>
-      </w:r>
+    </w:p>
+    <w:p>
+      <w:pPr>
+        <w:spacing w:before="0" w:after="20"/>
+        <w:ind w:left="170"/>
+      </w:pPr>
       <w:r>
         <w:rPr>
           <w:b/>
           <w:color w:val="1A2A4A"/>
           <w:sz w:val="17"/>
         </w:rPr>
-        <w:t xml:space="preserve">MPLS &amp; WAN: </w:t>
+        <w:t xml:space="preserve">Cloud &amp; Virtualization: </w:t>
       </w:r>
       <w:r>
         <w:rPr>
@@ -149,12 +149,13 @@
           <w:color w:val="555555"/>
           <w:sz w:val="17"/>
         </w:rPr>
-        <w:t>MPLS, MPLS VPN, TE, QoS, SD-WAN, VPN, IP Transit</w:t>
+        <w:t>Cisco HyperFlex (HCI), Cisco UCS, VMware vCenter/ESXi, Private Cloud, MicroCloud</w:t>
       </w:r>
     </w:p>
     <w:p>
       <w:pPr>
-        <w:spacing w:before="0" w:after="40"/>
+        <w:spacing w:before="0" w:after="20"/>
+        <w:ind w:left="170"/>
       </w:pPr>
       <w:r>
         <w:rPr>
@@ -162,7 +163,7 @@
           <w:color w:val="1A2A4A"/>
           <w:sz w:val="17"/>
         </w:rPr>
-        <w:t xml:space="preserve">Service Provider: </w:t>
+        <w:t xml:space="preserve">Data Center &amp; Automation: </w:t>
       </w:r>
       <w:r>
         <w:rPr>
@@ -170,16 +171,14 @@
           <w:color w:val="555555"/>
           <w:sz w:val="17"/>
         </w:rPr>
-        <w:t>FTTH, DIA, IGW, eBGP/iBGP, CDN Peering, Capacity Planning</w:t>
+        <w:t>Cisco ACI, UCS Manager, Firewall-as-a-Service (FWaaS)</w:t>
       </w:r>
-      <w:r>
-        <w:rPr>
-          <w:b w:val="0"/>
-          <w:color w:val="DDDDDD"/>
-          <w:sz w:val="17"/>
-        </w:rPr>
-        <w:t xml:space="preserve">    |    </w:t>
-      </w:r>
+    </w:p>
+    <w:p>
+      <w:pPr>
+        <w:spacing w:before="0" w:after="20"/>
+        <w:ind w:left="170"/>
+      </w:pPr>
       <w:r>
         <w:rPr>
           <w:b/>
@@ -199,7 +198,8 @@
     </w:p>
     <w:p>
       <w:pPr>
-        <w:spacing w:before="0" w:after="40"/>
+        <w:spacing w:before="0" w:after="20"/>
+        <w:ind w:left="170"/>
       </w:pPr>
       <w:r>
         <w:rPr>
@@ -207,7 +207,7 @@
           <w:color w:val="1A2A4A"/>
           <w:sz w:val="17"/>
         </w:rPr>
-        <w:t xml:space="preserve">Data Center: </w:t>
+        <w:t xml:space="preserve">Smart City &amp; IoT: </w:t>
       </w:r>
       <w:r>
         <w:rPr>
@@ -215,23 +215,21 @@
           <w:color w:val="555555"/>
           <w:sz w:val="17"/>
         </w:rPr>
-        <w:t>Cisco ACI, Nexus, UCS, FWaaS</w:t>
+        <w:t>AI VMS (Eocortex, Scylla AI), IoT connectivity, GPU infrastructure</w:t>
       </w:r>
-      <w:r>
-        <w:rPr>
-          <w:b w:val="0"/>
-          <w:color w:val="DDDDDD"/>
-          <w:sz w:val="17"/>
-        </w:rPr>
-        <w:t xml:space="preserve">    |    </w:t>
-      </w:r>
+    </w:p>
+    <w:p>
+      <w:pPr>
+        <w:spacing w:before="0" w:after="20"/>
+        <w:ind w:left="170"/>
+      </w:pPr>
       <w:r>
         <w:rPr>
           <w:b/>
           <w:color w:val="1A2A4A"/>
           <w:sz w:val="17"/>
         </w:rPr>
-        <w:t xml:space="preserve">Monitoring &amp; Voice: </w:t>
+        <w:t xml:space="preserve">Monitoring: </w:t>
       </w:r>
       <w:r>
         <w:rPr>
@@ -239,7 +237,29 @@
           <w:color w:val="555555"/>
           <w:sz w:val="17"/>
         </w:rPr>
-        <w:t>Zabbix, SNMP, Cacti, VoIP/SIP</w:t>
+        <w:t>Zabbix, SNMP, Cacti</w:t>
+      </w:r>
+    </w:p>
+    <w:p>
+      <w:pPr>
+        <w:spacing w:before="0" w:after="20"/>
+        <w:ind w:left="170"/>
+      </w:pPr>
+      <w:r>
+        <w:rPr>
+          <w:b/>
+          <w:color w:val="1A2A4A"/>
+          <w:sz w:val="17"/>
+        </w:rPr>
+        <w:t xml:space="preserve">Voice &amp; PBX: </w:t>
+      </w:r>
+      <w:r>
+        <w:rPr>
+          <w:b w:val="0"/>
+          <w:color w:val="555555"/>
+          <w:sz w:val="17"/>
+        </w:rPr>
+        <w:t>Cloud PBX, VoIP, SIP Trunking</w:t>
       </w:r>
     </w:p>
     <w:p>
@@ -255,7 +275,7 @@
           <w:color w:val="1A2A4A"/>
           <w:sz w:val="20"/>
         </w:rPr>
-        <w:t>EXPERIENCE</w:t>
+        <w:t>PROFESSIONAL EXPERIENCE</w:t>
       </w:r>
     </w:p>
     <w:p>
@@ -276,7 +296,7 @@
           <w:color w:val="999999"/>
           <w:sz w:val="16"/>
         </w:rPr>
-        <w:t xml:space="preserve">    Jun 2024 – Present</w:t>
+        <w:t xml:space="preserve">    June 2024 – Present</w:t>
       </w:r>
     </w:p>
     <w:p>
@@ -289,7 +309,49 @@
           <w:color w:val="4A6A8A"/>
           <w:sz w:val="18"/>
         </w:rPr>
-        <w:t>Planetcomm / Planetcloud, Bangkok, Thailand</w:t>
+        <w:t>PLANETCOMM / PLANETCLOUD — Bangkok, Thailand</w:t>
+      </w:r>
+    </w:p>
+    <w:p>
+      <w:pPr>
+        <w:spacing w:before="0" w:after="20"/>
+        <w:ind w:left="283" w:hanging="170"/>
+      </w:pPr>
+      <w:r>
+        <w:rPr>
+          <w:b w:val="0"/>
+          <w:color w:val="555555"/>
+          <w:sz w:val="17"/>
+        </w:rPr>
+        <w:t>▸  Designed and operated Cisco HyperFlex HCI and UCS-based private cloud environments</w:t>
+      </w:r>
+    </w:p>
+    <w:p>
+      <w:pPr>
+        <w:spacing w:before="0" w:after="20"/>
+        <w:ind w:left="283" w:hanging="170"/>
+      </w:pPr>
+      <w:r>
+        <w:rPr>
+          <w:b w:val="0"/>
+          <w:color w:val="555555"/>
+          <w:sz w:val="17"/>
+        </w:rPr>
+        <w:t>▸  Managed virtualization infrastructure using VMware vCenter and automated provisioning workflows</w:t>
+      </w:r>
+    </w:p>
+    <w:p>
+      <w:pPr>
+        <w:spacing w:before="0" w:after="20"/>
+        <w:ind w:left="283" w:hanging="170"/>
+      </w:pPr>
+      <w:r>
+        <w:rPr>
+          <w:b w:val="0"/>
+          <w:color w:val="555555"/>
+          <w:sz w:val="17"/>
+        </w:rPr>
+        <w:t>▸  Implemented MicroCloud environments for rapid POC and edge deployments</w:t>
       </w:r>
     </w:p>
     <w:p>
@@ -345,7 +407,7 @@
           <w:color w:val="555555"/>
           <w:sz w:val="17"/>
         </w:rPr>
-        <w:t>▸  Designed and implemented SPDC Data Center and FWaaS firewall solutions</w:t>
+        <w:t>▸  Designed and implemented SPDC Data Center and FWaaS solutions</w:t>
       </w:r>
     </w:p>
     <w:p>
@@ -359,7 +421,7 @@
           <w:color w:val="555555"/>
           <w:sz w:val="17"/>
         </w:rPr>
-        <w:t>▸  Collaborated with cross-vendor teams for integrated network and infrastructure deployments</w:t>
+        <w:t>▸  Collaborated with cross-vendor teams for integrated cloud and Smart City deployments</w:t>
       </w:r>
     </w:p>
     <w:p>
@@ -380,7 +442,7 @@
           <w:color w:val="999999"/>
           <w:sz w:val="16"/>
         </w:rPr>
-        <w:t xml:space="preserve">    Dec 2011 – Jun 2024</w:t>
+        <w:t xml:space="preserve">    December 2011 – June 2024</w:t>
       </w:r>
     </w:p>
     <w:p>
@@ -393,7 +455,7 @@
           <w:color w:val="4A6A8A"/>
           <w:sz w:val="18"/>
         </w:rPr>
-        <w:t>Global Technology Co., Ltd., Myanmar</w:t>
+        <w:t>GLOBAL TECHNOLOGY CO., LTD. — Myanmar</w:t>
       </w:r>
     </w:p>
     <w:p>
@@ -407,7 +469,7 @@
           <w:color w:val="555555"/>
           <w:sz w:val="17"/>
         </w:rPr>
-        <w:t>▸  Operated nationwide ISP core network infrastructure supporting millions of users</w:t>
+        <w:t>▸  Operated and maintained nationwide ISP core network infrastructure supporting millions of users</w:t>
       </w:r>
     </w:p>
     <w:p>
@@ -449,7 +511,7 @@
           <w:color w:val="555555"/>
           <w:sz w:val="17"/>
         </w:rPr>
-        <w:t>▸  Built International Gateway networks with eBGP/iBGP peering and global CDNs (Google, Facebook, Netflix)</w:t>
+        <w:t>▸  Built International Gateway (IGW) networks with eBGP/iBGP peering and global CDNs (Google, Facebook, Netflix)</w:t>
       </w:r>
     </w:p>
     <w:p>
@@ -463,7 +525,7 @@
           <w:color w:val="555555"/>
           <w:sz w:val="17"/>
         </w:rPr>
-        <w:t>▸  Deployed MPLS core network using IS-IS, MP-BGP, Traffic Engineering, and QoS</w:t>
+        <w:t>▸  Designed and deployed MPLS core network using IS-IS, MP-BGP, TE, and QoS</w:t>
       </w:r>
     </w:p>
     <w:p>
@@ -504,28 +566,7 @@
           <w:color w:val="1A2A4A"/>
           <w:sz w:val="20"/>
         </w:rPr>
-        <w:t>Smart City &amp; Network Projects</w:t>
-      </w:r>
-      <w:r>
-        <w:rPr>
-          <w:b w:val="0"/>
-          <w:color w:val="999999"/>
-          <w:sz w:val="16"/>
-        </w:rPr>
-        <w:t xml:space="preserve">    2018 – Present</w:t>
-      </w:r>
-    </w:p>
-    <w:p>
-      <w:pPr>
-        <w:spacing w:before="0" w:after="40"/>
-      </w:pPr>
-      <w:r>
-        <w:rPr>
-          <w:b w:val="0"/>
-          <w:color w:val="4A6A8A"/>
-          <w:sz w:val="18"/>
-        </w:rPr>
-        <w:t>Various Projects</w:t>
+        <w:t>Smart City &amp; AI Platform Projects</w:t>
       </w:r>
     </w:p>
     <w:p>
@@ -540,6 +581,34 @@
           <w:sz w:val="17"/>
         </w:rPr>
         <w:t>▸  Designed Smart City network infrastructure for urban surveillance and IoT integration</w:t>
+      </w:r>
+    </w:p>
+    <w:p>
+      <w:pPr>
+        <w:spacing w:before="0" w:after="20"/>
+        <w:ind w:left="283" w:hanging="170"/>
+      </w:pPr>
+      <w:r>
+        <w:rPr>
+          <w:b w:val="0"/>
+          <w:color w:val="555555"/>
+          <w:sz w:val="17"/>
+        </w:rPr>
+        <w:t>▸  Deployed AI VMS (Eocortex, Scylla AI) with facial recognition, object detection, and behavior analytics</w:t>
+      </w:r>
+    </w:p>
+    <w:p>
+      <w:pPr>
+        <w:spacing w:before="0" w:after="20"/>
+        <w:ind w:left="283" w:hanging="170"/>
+      </w:pPr>
+      <w:r>
+        <w:rPr>
+          <w:b w:val="0"/>
+          <w:color w:val="555555"/>
+          <w:sz w:val="17"/>
+        </w:rPr>
+        <w:t>▸  Architected GPU-enabled edge and data center environments for real-time AI inference</w:t>
       </w:r>
     </w:p>
     <w:p>
@@ -574,13 +643,13 @@
           <w:color w:val="1A2A4A"/>
           <w:sz w:val="20"/>
         </w:rPr>
-        <w:t>CERTIFICATIONS &amp; TRAINING</w:t>
+        <w:t>CERTIFICATIONS</w:t>
       </w:r>
     </w:p>
     <w:p>
       <w:pPr>
-        <w:spacing w:before="0" w:after="40"/>
-        <w:ind w:left="283" w:hanging="170"/>
+        <w:spacing w:before="0" w:after="80"/>
+        <w:ind w:left="170"/>
       </w:pPr>
       <w:r>
         <w:rPr>
@@ -596,7 +665,37 @@
           <w:color w:val="1A2A4A"/>
           <w:sz w:val="17"/>
         </w:rPr>
-        <w:t xml:space="preserve">Cisco Certified Specialist – ENARSI </w:t>
+        <w:t>Cisco Certified Specialist – ENARSI</w:t>
+      </w:r>
+    </w:p>
+    <w:p>
+      <w:pPr>
+        <w:spacing w:before="280" w:after="80"/>
+        <w:pBdr>
+          <w:bottom w:val="single" w:sz="8" w:space="1" w:color="1A2A4A"/>
+        </w:pBdr>
+      </w:pPr>
+      <w:r>
+        <w:rPr>
+          <w:b/>
+          <w:color w:val="1A2A4A"/>
+          <w:sz w:val="20"/>
+        </w:rPr>
+        <w:t>TRAINING &amp; PROFESSIONAL DEVELOPMENT</w:t>
+      </w:r>
+    </w:p>
+    <w:p>
+      <w:pPr>
+        <w:spacing w:before="0" w:after="40"/>
+        <w:ind w:left="170"/>
+      </w:pPr>
+      <w:r>
+        <w:rPr>
+          <w:b w:val="0"/>
+          <w:color w:val="4A6A8A"/>
+          <w:sz w:val="17"/>
+        </w:rPr>
+        <w:t xml:space="preserve">▸  </w:t>
       </w:r>
       <w:r>
         <w:rPr>
@@ -604,13 +703,102 @@
           <w:color w:val="555555"/>
           <w:sz w:val="17"/>
         </w:rPr>
-        <w:t xml:space="preserve"> —  Cisco Certified</w:t>
+        <w:t>CCIE Service Provider Training – BIM</w:t>
       </w:r>
     </w:p>
     <w:p>
       <w:pPr>
         <w:spacing w:before="0" w:after="40"/>
-        <w:ind w:left="283" w:hanging="170"/>
+        <w:ind w:left="170"/>
+      </w:pPr>
+      <w:r>
+        <w:rPr>
+          <w:b w:val="0"/>
+          <w:color w:val="4A6A8A"/>
+          <w:sz w:val="17"/>
+        </w:rPr>
+        <w:t xml:space="preserve">▸  </w:t>
+      </w:r>
+      <w:r>
+        <w:rPr>
+          <w:b w:val="0"/>
+          <w:color w:val="555555"/>
+          <w:sz w:val="17"/>
+        </w:rPr>
+        <w:t>CCIE Enterprise Infrastructure Training – Sai Nyan Lynn (3× CCIE #38501 – R&amp;S, SP, DC)</w:t>
+      </w:r>
+    </w:p>
+    <w:p>
+      <w:pPr>
+        <w:spacing w:before="0" w:after="40"/>
+        <w:ind w:left="170"/>
+      </w:pPr>
+      <w:r>
+        <w:rPr>
+          <w:b w:val="0"/>
+          <w:color w:val="4A6A8A"/>
+          <w:sz w:val="17"/>
+        </w:rPr>
+        <w:t xml:space="preserve">▸  </w:t>
+      </w:r>
+      <w:r>
+        <w:rPr>
+          <w:b w:val="0"/>
+          <w:color w:val="555555"/>
+          <w:sz w:val="17"/>
+        </w:rPr>
+        <w:t>CCNP Routing &amp; Switching Training – Aung Naing Moe</w:t>
+      </w:r>
+    </w:p>
+    <w:p>
+      <w:pPr>
+        <w:spacing w:before="280" w:after="80"/>
+        <w:pBdr>
+          <w:bottom w:val="single" w:sz="8" w:space="1" w:color="1A2A4A"/>
+        </w:pBdr>
+      </w:pPr>
+      <w:r>
+        <w:rPr>
+          <w:b/>
+          <w:color w:val="1A2A4A"/>
+          <w:sz w:val="20"/>
+        </w:rPr>
+        <w:t>HANDS-ON DEVICES</w:t>
+      </w:r>
+    </w:p>
+    <w:p>
+      <w:pPr>
+        <w:spacing w:before="0" w:after="80" w:line="276" w:lineRule="auto"/>
+      </w:pPr>
+      <w:r>
+        <w:rPr>
+          <w:b w:val="0"/>
+          <w:color w:val="555555"/>
+          <w:sz w:val="17"/>
+        </w:rPr>
+        <w:t>Cisco ASR 9010/9006/7710/1001/903/920 | Cisco NCS 540/520 | Cisco ISR 4321 | Cisco Catalyst 3650/4508/6504/C8300 | Cisco Nexus 3524 | Cisco ASA/FTD/FMC | FortiGate 30E/60E | Huawei NetEngine 8000 | SIP &amp; Voice Platforms</w:t>
+      </w:r>
+    </w:p>
+    <w:p>
+      <w:pPr>
+        <w:spacing w:before="280" w:after="80"/>
+        <w:pBdr>
+          <w:bottom w:val="single" w:sz="8" w:space="1" w:color="1A2A4A"/>
+        </w:pBdr>
+      </w:pPr>
+      <w:r>
+        <w:rPr>
+          <w:b/>
+          <w:color w:val="1A2A4A"/>
+          <w:sz w:val="20"/>
+        </w:rPr>
+        <w:t>EDUCATION</w:t>
+      </w:r>
+    </w:p>
+    <w:p>
+      <w:pPr>
+        <w:spacing w:before="0" w:after="40"/>
+        <w:ind w:left="170"/>
       </w:pPr>
       <w:r>
         <w:rPr>
@@ -626,7 +814,7 @@
           <w:color w:val="1A2A4A"/>
           <w:sz w:val="17"/>
         </w:rPr>
-        <w:t xml:space="preserve">CCIE Service Provider </w:t>
+        <w:t>Bachelor of Arts in English</w:t>
       </w:r>
       <w:r>
         <w:rPr>
@@ -634,67 +822,7 @@
           <w:color w:val="555555"/>
           <w:sz w:val="17"/>
         </w:rPr>
-        <w:t xml:space="preserve"> —  Training</w:t>
-      </w:r>
-    </w:p>
-    <w:p>
-      <w:pPr>
-        <w:spacing w:before="0" w:after="40"/>
-        <w:ind w:left="283" w:hanging="170"/>
-      </w:pPr>
-      <w:r>
-        <w:rPr>
-          <w:b w:val="0"/>
-          <w:color w:val="4A6A8A"/>
-          <w:sz w:val="17"/>
-        </w:rPr>
-        <w:t xml:space="preserve">▸  </w:t>
-      </w:r>
-      <w:r>
-        <w:rPr>
-          <w:b/>
-          <w:color w:val="1A2A4A"/>
-          <w:sz w:val="17"/>
-        </w:rPr>
-        <w:t xml:space="preserve">CCIE Enterprise Infrastructure </w:t>
-      </w:r>
-      <w:r>
-        <w:rPr>
-          <w:b w:val="0"/>
-          <w:color w:val="555555"/>
-          <w:sz w:val="17"/>
-        </w:rPr>
-        <w:t xml:space="preserve"> —  Training</w:t>
-      </w:r>
-    </w:p>
-    <w:p>
-      <w:pPr>
-        <w:spacing w:before="0" w:after="40"/>
-        <w:ind w:left="283" w:hanging="170"/>
-      </w:pPr>
-      <w:r>
-        <w:rPr>
-          <w:b w:val="0"/>
-          <w:color w:val="4A6A8A"/>
-          <w:sz w:val="17"/>
-        </w:rPr>
-        <w:t xml:space="preserve">▸  </w:t>
-      </w:r>
-      <w:r>
-        <w:rPr>
-          <w:b/>
-          <w:color w:val="1A2A4A"/>
-          <w:sz w:val="17"/>
-        </w:rPr>
-        <w:t xml:space="preserve">CCNP Routing &amp; Switching </w:t>
-      </w:r>
-      <w:r>
-        <w:rPr>
-          <w:b w:val="0"/>
-          <w:color w:val="555555"/>
-          <w:sz w:val="17"/>
-        </w:rPr>
-        <w:t xml:space="preserve"> —  Training</w:t>
+        <w:t xml:space="preserve"> — Mandalaya University, Myanmar (2011–2016)</w:t>
       </w:r>
     </w:p>
     <w:p>
@@ -710,78 +838,51 @@
           <w:color w:val="1A2A4A"/>
           <w:sz w:val="20"/>
         </w:rPr>
-        <w:t>HANDS-ON EQUIPMENT</w:t>
+        <w:t>LANGUAGES</w:t>
       </w:r>
     </w:p>
     <w:p>
       <w:pPr>
-        <w:spacing w:before="0" w:after="80" w:line="276" w:lineRule="auto"/>
+        <w:spacing w:before="0" w:after="40"/>
+        <w:ind w:left="170"/>
       </w:pPr>
+      <w:r>
+        <w:rPr>
+          <w:b w:val="0"/>
+          <w:color w:val="4A6A8A"/>
+          <w:sz w:val="17"/>
+        </w:rPr>
+        <w:t xml:space="preserve">▸  </w:t>
+      </w:r>
       <w:r>
         <w:rPr>
           <w:b w:val="0"/>
           <w:color w:val="555555"/>
           <w:sz w:val="17"/>
         </w:rPr>
-        <w:t>Cisco ASR9K, NCS 5500/6000, Juniper MX, Nexus 9K/7K/5K/2K, Catalyst 9K, Cisco UCS, Cisco ACI, Cisco FMC/FTD/ASA, FortiGate, MikroTik, Zabbix</w:t>
-      </w:r>
-    </w:p>
-    <w:p>
-      <w:pPr>
-        <w:spacing w:before="280" w:after="80"/>
-        <w:pBdr>
-          <w:bottom w:val="single" w:sz="8" w:space="1" w:color="1A2A4A"/>
-        </w:pBdr>
-      </w:pPr>
-      <w:r>
-        <w:rPr>
-          <w:b/>
-          <w:color w:val="1A2A4A"/>
-          <w:sz w:val="20"/>
-        </w:rPr>
-        <w:t>ADDITIONAL INFO</w:t>
+        <w:t>English: Professional Working</w:t>
       </w:r>
     </w:p>
     <w:p>
       <w:pPr>
         <w:spacing w:before="0" w:after="40"/>
+        <w:ind w:left="170"/>
       </w:pPr>
       <w:r>
         <w:rPr>
-          <w:b/>
-          <w:color w:val="1A2A4A"/>
-          <w:sz w:val="18"/>
+          <w:b w:val="0"/>
+          <w:color w:val="4A6A8A"/>
+          <w:sz w:val="17"/>
         </w:rPr>
-        <w:t xml:space="preserve">Languages: </w:t>
+        <w:t xml:space="preserve">▸  </w:t>
       </w:r>
       <w:r>
         <w:rPr>
           <w:b w:val="0"/>
           <w:color w:val="555555"/>
-          <w:sz w:val="18"/>
+          <w:sz w:val="17"/>
         </w:rPr>
-        <w:t>English (Professional Working)  |  Burmese (Native)</w:t>
-      </w:r>
-    </w:p>
-    <w:p>
-      <w:pPr>
-        <w:spacing w:before="0" w:after="40"/>
-      </w:pPr>
-      <w:r>
-        <w:rPr>
-          <w:b/>
-          <w:color w:val="1A2A4A"/>
-          <w:sz w:val="18"/>
-        </w:rPr>
-        <w:t xml:space="preserve">Education: </w:t>
-      </w:r>
-      <w:r>
-        <w:rPr>
-          <w:b w:val="0"/>
-          <w:color w:val="555555"/>
-          <w:sz w:val="18"/>
-        </w:rPr>
-        <w:t>B.A. English — Mandalaya University, 2011–2016</w:t>
+        <w:t>Burmese: Native</w:t>
       </w:r>
     </w:p>
     <w:sectPr>

</xml_diff>